<commit_message>
Contrôle de l'existence d'une collaboration avant l'ajout et la mis à jour du manuel de déploiment, la video Tutotielle aussi
</commit_message>
<xml_diff>
--- a/MANUEL DE DEPLOIEMENT.docx
+++ b/MANUEL DE DEPLOIEMENT.docx
@@ -239,6 +239,211 @@
     <w:p>
       <w:pPr>
         <w:pStyle w:val="ListParagraph"/>
+        <w:numPr>
+          <w:ilvl w:val="0"/>
+          <w:numId w:val="5"/>
+        </w:numPr>
+        <w:rPr>
+          <w:rFonts w:ascii="Times New Roman" w:hAnsi="Times New Roman" w:cs="Times New Roman"/>
+          <w:sz w:val="28"/>
+          <w:szCs w:val="28"/>
+        </w:rPr>
+      </w:pPr>
+      <w:r>
+        <w:rPr>
+          <w:rFonts w:ascii="Times New Roman" w:hAnsi="Times New Roman" w:cs="Times New Roman"/>
+          <w:sz w:val="28"/>
+          <w:szCs w:val="28"/>
+        </w:rPr>
+        <w:t xml:space="preserve">Contenu de </w:t>
+      </w:r>
+      <w:proofErr w:type="spellStart"/>
+      <w:r>
+        <w:rPr>
+          <w:rFonts w:ascii="Times New Roman" w:hAnsi="Times New Roman" w:cs="Times New Roman"/>
+          <w:sz w:val="28"/>
+          <w:szCs w:val="28"/>
+        </w:rPr>
+        <w:t>sygp.sql</w:t>
+      </w:r>
+      <w:proofErr w:type="spellEnd"/>
+      <w:r>
+        <w:rPr>
+          <w:rFonts w:ascii="Times New Roman" w:hAnsi="Times New Roman" w:cs="Times New Roman"/>
+          <w:sz w:val="28"/>
+          <w:szCs w:val="28"/>
+        </w:rPr>
+        <w:t xml:space="preserve"> en capture :</w:t>
+      </w:r>
+    </w:p>
+    <w:p>
+      <w:pPr>
+        <w:rPr>
+          <w:rFonts w:ascii="Times New Roman" w:hAnsi="Times New Roman" w:cs="Times New Roman"/>
+          <w:sz w:val="28"/>
+          <w:szCs w:val="28"/>
+        </w:rPr>
+      </w:pPr>
+      <w:r>
+        <w:rPr>
+          <w:rFonts w:ascii="Times New Roman" w:hAnsi="Times New Roman" w:cs="Times New Roman"/>
+          <w:sz w:val="28"/>
+          <w:szCs w:val="28"/>
+        </w:rPr>
+        <w:drawing>
+          <wp:inline distT="0" distB="0" distL="0" distR="0" wp14:anchorId="60DC859A" wp14:editId="5CC77648">
+            <wp:extent cx="5760720" cy="3453130"/>
+            <wp:effectExtent l="0" t="0" r="0" b="0"/>
+            <wp:docPr id="24" name="Picture 24"/>
+            <wp:cNvGraphicFramePr>
+              <a:graphicFrameLocks xmlns:a="http://schemas.openxmlformats.org/drawingml/2006/main" noChangeAspect="1"/>
+            </wp:cNvGraphicFramePr>
+            <a:graphic xmlns:a="http://schemas.openxmlformats.org/drawingml/2006/main">
+              <a:graphicData uri="http://schemas.openxmlformats.org/drawingml/2006/picture">
+                <pic:pic xmlns:pic="http://schemas.openxmlformats.org/drawingml/2006/picture">
+                  <pic:nvPicPr>
+                    <pic:cNvPr id="1" name=""/>
+                    <pic:cNvPicPr/>
+                  </pic:nvPicPr>
+                  <pic:blipFill>
+                    <a:blip r:embed="rId5"/>
+                    <a:stretch>
+                      <a:fillRect/>
+                    </a:stretch>
+                  </pic:blipFill>
+                  <pic:spPr>
+                    <a:xfrm>
+                      <a:off x="0" y="0"/>
+                      <a:ext cx="5760720" cy="3453130"/>
+                    </a:xfrm>
+                    <a:prstGeom prst="rect">
+                      <a:avLst/>
+                    </a:prstGeom>
+                  </pic:spPr>
+                </pic:pic>
+              </a:graphicData>
+            </a:graphic>
+          </wp:inline>
+        </w:drawing>
+      </w:r>
+    </w:p>
+    <w:p>
+      <w:pPr>
+        <w:rPr>
+          <w:rFonts w:ascii="Times New Roman" w:hAnsi="Times New Roman" w:cs="Times New Roman"/>
+          <w:sz w:val="28"/>
+          <w:szCs w:val="28"/>
+        </w:rPr>
+      </w:pPr>
+      <w:r>
+        <w:rPr>
+          <w:rFonts w:ascii="Times New Roman" w:hAnsi="Times New Roman" w:cs="Times New Roman"/>
+          <w:sz w:val="28"/>
+          <w:szCs w:val="28"/>
+        </w:rPr>
+        <w:lastRenderedPageBreak/>
+        <w:drawing>
+          <wp:inline distT="0" distB="0" distL="0" distR="0" wp14:anchorId="60F7D4DA" wp14:editId="07D342A4">
+            <wp:extent cx="5760720" cy="3620135"/>
+            <wp:effectExtent l="0" t="0" r="0" b="0"/>
+            <wp:docPr id="25" name="Picture 25"/>
+            <wp:cNvGraphicFramePr>
+              <a:graphicFrameLocks xmlns:a="http://schemas.openxmlformats.org/drawingml/2006/main" noChangeAspect="1"/>
+            </wp:cNvGraphicFramePr>
+            <a:graphic xmlns:a="http://schemas.openxmlformats.org/drawingml/2006/main">
+              <a:graphicData uri="http://schemas.openxmlformats.org/drawingml/2006/picture">
+                <pic:pic xmlns:pic="http://schemas.openxmlformats.org/drawingml/2006/picture">
+                  <pic:nvPicPr>
+                    <pic:cNvPr id="1" name=""/>
+                    <pic:cNvPicPr/>
+                  </pic:nvPicPr>
+                  <pic:blipFill>
+                    <a:blip r:embed="rId6"/>
+                    <a:stretch>
+                      <a:fillRect/>
+                    </a:stretch>
+                  </pic:blipFill>
+                  <pic:spPr>
+                    <a:xfrm>
+                      <a:off x="0" y="0"/>
+                      <a:ext cx="5760720" cy="3620135"/>
+                    </a:xfrm>
+                    <a:prstGeom prst="rect">
+                      <a:avLst/>
+                    </a:prstGeom>
+                  </pic:spPr>
+                </pic:pic>
+              </a:graphicData>
+            </a:graphic>
+          </wp:inline>
+        </w:drawing>
+      </w:r>
+    </w:p>
+    <w:p>
+      <w:pPr>
+        <w:rPr>
+          <w:rFonts w:ascii="Times New Roman" w:hAnsi="Times New Roman" w:cs="Times New Roman"/>
+          <w:sz w:val="28"/>
+          <w:szCs w:val="28"/>
+        </w:rPr>
+      </w:pPr>
+      <w:r>
+        <w:rPr>
+          <w:rFonts w:ascii="Times New Roman" w:hAnsi="Times New Roman" w:cs="Times New Roman"/>
+          <w:sz w:val="28"/>
+          <w:szCs w:val="28"/>
+        </w:rPr>
+        <w:drawing>
+          <wp:inline distT="0" distB="0" distL="0" distR="0" wp14:anchorId="14A4E7CD" wp14:editId="54CDD765">
+            <wp:extent cx="5760720" cy="2805430"/>
+            <wp:effectExtent l="0" t="0" r="0" b="0"/>
+            <wp:docPr id="26" name="Picture 26"/>
+            <wp:cNvGraphicFramePr>
+              <a:graphicFrameLocks xmlns:a="http://schemas.openxmlformats.org/drawingml/2006/main" noChangeAspect="1"/>
+            </wp:cNvGraphicFramePr>
+            <a:graphic xmlns:a="http://schemas.openxmlformats.org/drawingml/2006/main">
+              <a:graphicData uri="http://schemas.openxmlformats.org/drawingml/2006/picture">
+                <pic:pic xmlns:pic="http://schemas.openxmlformats.org/drawingml/2006/picture">
+                  <pic:nvPicPr>
+                    <pic:cNvPr id="1" name=""/>
+                    <pic:cNvPicPr/>
+                  </pic:nvPicPr>
+                  <pic:blipFill>
+                    <a:blip r:embed="rId7"/>
+                    <a:stretch>
+                      <a:fillRect/>
+                    </a:stretch>
+                  </pic:blipFill>
+                  <pic:spPr>
+                    <a:xfrm>
+                      <a:off x="0" y="0"/>
+                      <a:ext cx="5760720" cy="2805430"/>
+                    </a:xfrm>
+                    <a:prstGeom prst="rect">
+                      <a:avLst/>
+                    </a:prstGeom>
+                  </pic:spPr>
+                </pic:pic>
+              </a:graphicData>
+            </a:graphic>
+          </wp:inline>
+        </w:drawing>
+      </w:r>
+    </w:p>
+    <w:p>
+      <w:pPr>
+        <w:pStyle w:val="ListParagraph"/>
+        <w:ind w:left="1440"/>
+        <w:rPr>
+          <w:rFonts w:ascii="Times New Roman" w:hAnsi="Times New Roman" w:cs="Times New Roman"/>
+          <w:sz w:val="28"/>
+          <w:szCs w:val="28"/>
+        </w:rPr>
+      </w:pPr>
+    </w:p>
+    <w:p>
+      <w:pPr>
+        <w:pStyle w:val="ListParagraph"/>
         <w:ind w:left="1440"/>
         <w:rPr>
           <w:rFonts w:ascii="Times New Roman" w:hAnsi="Times New Roman" w:cs="Times New Roman"/>
@@ -421,6 +626,7 @@
           <w:sz w:val="28"/>
           <w:szCs w:val="28"/>
         </w:rPr>
+        <w:lastRenderedPageBreak/>
         <w:t>En fin il vous</w:t>
       </w:r>
       <w:r>
@@ -779,16 +985,7 @@
           <w:sz w:val="28"/>
           <w:szCs w:val="28"/>
         </w:rPr>
-        <w:t xml:space="preserve">), une adresse email et un mot se passe  fort(au mois une lettre Capitale, </w:t>
-      </w:r>
-      <w:r>
-        <w:rPr>
-          <w:rFonts w:ascii="Times New Roman" w:hAnsi="Times New Roman" w:cs="Times New Roman"/>
-          <w:sz w:val="28"/>
-          <w:szCs w:val="28"/>
-        </w:rPr>
-        <w:lastRenderedPageBreak/>
-        <w:t xml:space="preserve">minuscule, au moins un caractère numérique et un </w:t>
+        <w:t xml:space="preserve">), une adresse email et un mot se passe  fort(au mois une lettre Capitale, minuscule, au moins un caractère numérique et un </w:t>
       </w:r>
       <w:r>
         <w:rPr>
@@ -831,7 +1028,36 @@
         <w:t>tères minimum</w:t>
       </w:r>
     </w:p>
-    <w:bookmarkEnd w:id="0"/>
+    <w:p>
+      <w:pPr>
+        <w:pStyle w:val="ListParagraph"/>
+        <w:ind w:left="1440"/>
+        <w:rPr>
+          <w:rFonts w:ascii="Times New Roman" w:hAnsi="Times New Roman" w:cs="Times New Roman"/>
+          <w:sz w:val="28"/>
+          <w:szCs w:val="28"/>
+        </w:rPr>
+      </w:pPr>
+      <w:r>
+        <w:rPr>
+          <w:rFonts w:ascii="Times New Roman" w:hAnsi="Times New Roman" w:cs="Times New Roman"/>
+          <w:sz w:val="28"/>
+          <w:szCs w:val="28"/>
+        </w:rPr>
+        <w:t>Voici le formulaire d’inscription :</w:t>
+      </w:r>
+    </w:p>
+    <w:p>
+      <w:pPr>
+        <w:pStyle w:val="ListParagraph"/>
+        <w:ind w:left="1440"/>
+        <w:rPr>
+          <w:rFonts w:ascii="Times New Roman" w:hAnsi="Times New Roman" w:cs="Times New Roman"/>
+          <w:sz w:val="28"/>
+          <w:szCs w:val="28"/>
+        </w:rPr>
+      </w:pPr>
+    </w:p>
     <w:p>
       <w:pPr>
         <w:pStyle w:val="ListParagraph"/>
@@ -839,6 +1065,2950 @@
           <w:ilvl w:val="0"/>
           <w:numId w:val="2"/>
         </w:numPr>
+        <w:rPr>
+          <w:rFonts w:ascii="Times New Roman" w:hAnsi="Times New Roman" w:cs="Times New Roman"/>
+          <w:b/>
+          <w:bCs/>
+          <w:sz w:val="28"/>
+          <w:szCs w:val="28"/>
+        </w:rPr>
+      </w:pPr>
+      <w:r>
+        <w:rPr>
+          <w:rFonts w:ascii="Times New Roman" w:hAnsi="Times New Roman" w:cs="Times New Roman"/>
+          <w:b/>
+          <w:bCs/>
+          <w:sz w:val="28"/>
+          <w:szCs w:val="28"/>
+        </w:rPr>
+        <w:t>Page d’</w:t>
+      </w:r>
+      <w:proofErr w:type="spellStart"/>
+      <w:r>
+        <w:rPr>
+          <w:rFonts w:ascii="Times New Roman" w:hAnsi="Times New Roman" w:cs="Times New Roman"/>
+          <w:b/>
+          <w:bCs/>
+          <w:sz w:val="28"/>
+          <w:szCs w:val="28"/>
+        </w:rPr>
+        <w:t>acceuil</w:t>
+      </w:r>
+      <w:proofErr w:type="spellEnd"/>
+    </w:p>
+    <w:p>
+      <w:pPr>
+        <w:rPr>
+          <w:rFonts w:ascii="Times New Roman" w:hAnsi="Times New Roman" w:cs="Times New Roman"/>
+          <w:sz w:val="28"/>
+          <w:szCs w:val="28"/>
+        </w:rPr>
+      </w:pPr>
+      <w:r>
+        <w:rPr>
+          <w:rFonts w:ascii="Times New Roman" w:hAnsi="Times New Roman" w:cs="Times New Roman"/>
+          <w:sz w:val="28"/>
+          <w:szCs w:val="28"/>
+        </w:rPr>
+        <w:drawing>
+          <wp:inline distT="0" distB="0" distL="0" distR="0" wp14:anchorId="2DDB4BEB" wp14:editId="136F7BCB">
+            <wp:extent cx="5760720" cy="1597025"/>
+            <wp:effectExtent l="0" t="0" r="0" b="3175"/>
+            <wp:docPr id="7" name="Picture 7"/>
+            <wp:cNvGraphicFramePr>
+              <a:graphicFrameLocks xmlns:a="http://schemas.openxmlformats.org/drawingml/2006/main" noChangeAspect="1"/>
+            </wp:cNvGraphicFramePr>
+            <a:graphic xmlns:a="http://schemas.openxmlformats.org/drawingml/2006/main">
+              <a:graphicData uri="http://schemas.openxmlformats.org/drawingml/2006/picture">
+                <pic:pic xmlns:pic="http://schemas.openxmlformats.org/drawingml/2006/picture">
+                  <pic:nvPicPr>
+                    <pic:cNvPr id="1" name=""/>
+                    <pic:cNvPicPr/>
+                  </pic:nvPicPr>
+                  <pic:blipFill>
+                    <a:blip r:embed="rId8"/>
+                    <a:stretch>
+                      <a:fillRect/>
+                    </a:stretch>
+                  </pic:blipFill>
+                  <pic:spPr>
+                    <a:xfrm>
+                      <a:off x="0" y="0"/>
+                      <a:ext cx="5760720" cy="1597025"/>
+                    </a:xfrm>
+                    <a:prstGeom prst="rect">
+                      <a:avLst/>
+                    </a:prstGeom>
+                  </pic:spPr>
+                </pic:pic>
+              </a:graphicData>
+            </a:graphic>
+          </wp:inline>
+        </w:drawing>
+      </w:r>
+    </w:p>
+    <w:p>
+      <w:pPr>
+        <w:pStyle w:val="ListParagraph"/>
+        <w:numPr>
+          <w:ilvl w:val="0"/>
+          <w:numId w:val="2"/>
+        </w:numPr>
+        <w:rPr>
+          <w:rFonts w:ascii="Times New Roman" w:hAnsi="Times New Roman" w:cs="Times New Roman"/>
+          <w:b/>
+          <w:bCs/>
+          <w:sz w:val="28"/>
+          <w:szCs w:val="28"/>
+        </w:rPr>
+      </w:pPr>
+      <w:r>
+        <w:rPr>
+          <w:rFonts w:ascii="Times New Roman" w:hAnsi="Times New Roman" w:cs="Times New Roman"/>
+          <w:b/>
+          <w:bCs/>
+          <w:sz w:val="28"/>
+          <w:szCs w:val="28"/>
+        </w:rPr>
+        <w:t xml:space="preserve">Page d’inscription </w:t>
+      </w:r>
+    </w:p>
+    <w:p>
+      <w:pPr>
+        <w:pStyle w:val="ListParagraph"/>
+        <w:ind w:left="1440"/>
+        <w:rPr>
+          <w:rFonts w:ascii="Times New Roman" w:hAnsi="Times New Roman" w:cs="Times New Roman"/>
+          <w:sz w:val="28"/>
+          <w:szCs w:val="28"/>
+        </w:rPr>
+      </w:pPr>
+    </w:p>
+    <w:bookmarkEnd w:id="0"/>
+    <w:p>
+      <w:pPr>
+        <w:rPr>
+          <w:rFonts w:ascii="Times New Roman" w:hAnsi="Times New Roman" w:cs="Times New Roman"/>
+          <w:sz w:val="28"/>
+          <w:szCs w:val="28"/>
+        </w:rPr>
+      </w:pPr>
+      <w:r>
+        <w:rPr>
+          <w:noProof/>
+        </w:rPr>
+        <w:lastRenderedPageBreak/>
+        <w:drawing>
+          <wp:inline distT="0" distB="0" distL="0" distR="0" wp14:anchorId="7324062B" wp14:editId="4A5582A8">
+            <wp:extent cx="5760720" cy="2825115"/>
+            <wp:effectExtent l="0" t="0" r="0" b="0"/>
+            <wp:docPr id="1" name="Picture 1"/>
+            <wp:cNvGraphicFramePr>
+              <a:graphicFrameLocks xmlns:a="http://schemas.openxmlformats.org/drawingml/2006/main" noChangeAspect="1"/>
+            </wp:cNvGraphicFramePr>
+            <a:graphic xmlns:a="http://schemas.openxmlformats.org/drawingml/2006/main">
+              <a:graphicData uri="http://schemas.openxmlformats.org/drawingml/2006/picture">
+                <pic:pic xmlns:pic="http://schemas.openxmlformats.org/drawingml/2006/picture">
+                  <pic:nvPicPr>
+                    <pic:cNvPr id="1" name=""/>
+                    <pic:cNvPicPr/>
+                  </pic:nvPicPr>
+                  <pic:blipFill>
+                    <a:blip r:embed="rId9"/>
+                    <a:stretch>
+                      <a:fillRect/>
+                    </a:stretch>
+                  </pic:blipFill>
+                  <pic:spPr>
+                    <a:xfrm>
+                      <a:off x="0" y="0"/>
+                      <a:ext cx="5760720" cy="2825115"/>
+                    </a:xfrm>
+                    <a:prstGeom prst="rect">
+                      <a:avLst/>
+                    </a:prstGeom>
+                  </pic:spPr>
+                </pic:pic>
+              </a:graphicData>
+            </a:graphic>
+          </wp:inline>
+        </w:drawing>
+      </w:r>
+    </w:p>
+    <w:p>
+      <w:pPr>
+        <w:rPr>
+          <w:rFonts w:ascii="Times New Roman" w:hAnsi="Times New Roman" w:cs="Times New Roman"/>
+          <w:sz w:val="28"/>
+          <w:szCs w:val="28"/>
+        </w:rPr>
+      </w:pPr>
+    </w:p>
+    <w:p>
+      <w:pPr>
+        <w:rPr>
+          <w:rFonts w:ascii="Times New Roman" w:hAnsi="Times New Roman" w:cs="Times New Roman"/>
+          <w:sz w:val="28"/>
+          <w:szCs w:val="28"/>
+        </w:rPr>
+      </w:pPr>
+    </w:p>
+    <w:p>
+      <w:pPr>
+        <w:rPr>
+          <w:rFonts w:ascii="Times New Roman" w:hAnsi="Times New Roman" w:cs="Times New Roman"/>
+          <w:sz w:val="28"/>
+          <w:szCs w:val="28"/>
+        </w:rPr>
+      </w:pPr>
+    </w:p>
+    <w:p>
+      <w:pPr>
+        <w:rPr>
+          <w:rFonts w:ascii="Times New Roman" w:hAnsi="Times New Roman" w:cs="Times New Roman"/>
+          <w:sz w:val="28"/>
+          <w:szCs w:val="28"/>
+        </w:rPr>
+      </w:pPr>
+    </w:p>
+    <w:p>
+      <w:pPr>
+        <w:pStyle w:val="ListParagraph"/>
+        <w:numPr>
+          <w:ilvl w:val="0"/>
+          <w:numId w:val="3"/>
+        </w:numPr>
+        <w:rPr>
+          <w:rFonts w:ascii="Times New Roman" w:hAnsi="Times New Roman" w:cs="Times New Roman"/>
+          <w:b/>
+          <w:bCs/>
+          <w:sz w:val="28"/>
+          <w:szCs w:val="28"/>
+        </w:rPr>
+      </w:pPr>
+      <w:r>
+        <w:rPr>
+          <w:rFonts w:ascii="Times New Roman" w:hAnsi="Times New Roman" w:cs="Times New Roman"/>
+          <w:b/>
+          <w:bCs/>
+          <w:sz w:val="28"/>
+          <w:szCs w:val="28"/>
+        </w:rPr>
+        <w:t>Remplissage</w:t>
+      </w:r>
+    </w:p>
+    <w:p>
+      <w:pPr>
+        <w:rPr>
+          <w:rFonts w:ascii="Times New Roman" w:hAnsi="Times New Roman" w:cs="Times New Roman"/>
+          <w:sz w:val="28"/>
+          <w:szCs w:val="28"/>
+        </w:rPr>
+      </w:pPr>
+    </w:p>
+    <w:p>
+      <w:pPr>
+        <w:rPr>
+          <w:rFonts w:ascii="Times New Roman" w:hAnsi="Times New Roman" w:cs="Times New Roman"/>
+          <w:sz w:val="28"/>
+          <w:szCs w:val="28"/>
+        </w:rPr>
+      </w:pPr>
+      <w:r>
+        <w:rPr>
+          <w:rFonts w:ascii="Times New Roman" w:hAnsi="Times New Roman" w:cs="Times New Roman"/>
+          <w:noProof/>
+          <w:sz w:val="28"/>
+          <w:szCs w:val="28"/>
+        </w:rPr>
+        <w:drawing>
+          <wp:inline distT="0" distB="0" distL="0" distR="0" wp14:anchorId="2F76198E" wp14:editId="0FB8B3B7">
+            <wp:extent cx="5760720" cy="2830195"/>
+            <wp:effectExtent l="0" t="0" r="0" b="8255"/>
+            <wp:docPr id="2" name="Picture 2"/>
+            <wp:cNvGraphicFramePr>
+              <a:graphicFrameLocks xmlns:a="http://schemas.openxmlformats.org/drawingml/2006/main" noChangeAspect="1"/>
+            </wp:cNvGraphicFramePr>
+            <a:graphic xmlns:a="http://schemas.openxmlformats.org/drawingml/2006/main">
+              <a:graphicData uri="http://schemas.openxmlformats.org/drawingml/2006/picture">
+                <pic:pic xmlns:pic="http://schemas.openxmlformats.org/drawingml/2006/picture">
+                  <pic:nvPicPr>
+                    <pic:cNvPr id="1" name=""/>
+                    <pic:cNvPicPr/>
+                  </pic:nvPicPr>
+                  <pic:blipFill>
+                    <a:blip r:embed="rId10"/>
+                    <a:stretch>
+                      <a:fillRect/>
+                    </a:stretch>
+                  </pic:blipFill>
+                  <pic:spPr>
+                    <a:xfrm>
+                      <a:off x="0" y="0"/>
+                      <a:ext cx="5760720" cy="2830195"/>
+                    </a:xfrm>
+                    <a:prstGeom prst="rect">
+                      <a:avLst/>
+                    </a:prstGeom>
+                  </pic:spPr>
+                </pic:pic>
+              </a:graphicData>
+            </a:graphic>
+          </wp:inline>
+        </w:drawing>
+      </w:r>
+    </w:p>
+    <w:p>
+      <w:pPr>
+        <w:rPr>
+          <w:rFonts w:ascii="Times New Roman" w:hAnsi="Times New Roman" w:cs="Times New Roman"/>
+          <w:sz w:val="28"/>
+          <w:szCs w:val="28"/>
+        </w:rPr>
+      </w:pPr>
+    </w:p>
+    <w:p>
+      <w:pPr>
+        <w:rPr>
+          <w:rFonts w:ascii="Times New Roman" w:hAnsi="Times New Roman" w:cs="Times New Roman"/>
+          <w:sz w:val="28"/>
+          <w:szCs w:val="28"/>
+        </w:rPr>
+      </w:pPr>
+    </w:p>
+    <w:p>
+      <w:pPr>
+        <w:pStyle w:val="ListParagraph"/>
+        <w:numPr>
+          <w:ilvl w:val="0"/>
+          <w:numId w:val="2"/>
+        </w:numPr>
+        <w:rPr>
+          <w:rFonts w:ascii="Times New Roman" w:hAnsi="Times New Roman" w:cs="Times New Roman"/>
+          <w:b/>
+          <w:bCs/>
+          <w:sz w:val="28"/>
+          <w:szCs w:val="28"/>
+        </w:rPr>
+      </w:pPr>
+      <w:r>
+        <w:rPr>
+          <w:rFonts w:ascii="Times New Roman" w:hAnsi="Times New Roman" w:cs="Times New Roman"/>
+          <w:b/>
+          <w:bCs/>
+          <w:sz w:val="28"/>
+          <w:szCs w:val="28"/>
+        </w:rPr>
+        <w:t>Page d’authentification</w:t>
+      </w:r>
+      <w:r>
+        <w:rPr>
+          <w:rFonts w:ascii="Times New Roman" w:hAnsi="Times New Roman" w:cs="Times New Roman"/>
+          <w:b/>
+          <w:bCs/>
+          <w:sz w:val="28"/>
+          <w:szCs w:val="28"/>
+        </w:rPr>
+        <w:t xml:space="preserve"> </w:t>
+      </w:r>
+      <w:r>
+        <w:rPr>
+          <w:rFonts w:ascii="Times New Roman" w:hAnsi="Times New Roman" w:cs="Times New Roman"/>
+          <w:sz w:val="28"/>
+          <w:szCs w:val="28"/>
+        </w:rPr>
+        <w:t xml:space="preserve">: </w:t>
+      </w:r>
+    </w:p>
+    <w:p>
+      <w:pPr>
+        <w:rPr>
+          <w:rFonts w:ascii="Times New Roman" w:hAnsi="Times New Roman" w:cs="Times New Roman"/>
+          <w:sz w:val="28"/>
+          <w:szCs w:val="28"/>
+        </w:rPr>
+      </w:pPr>
+    </w:p>
+    <w:p>
+      <w:pPr>
+        <w:rPr>
+          <w:rFonts w:ascii="Times New Roman" w:hAnsi="Times New Roman" w:cs="Times New Roman"/>
+          <w:sz w:val="28"/>
+          <w:szCs w:val="28"/>
+        </w:rPr>
+      </w:pPr>
+    </w:p>
+    <w:p>
+      <w:pPr>
+        <w:rPr>
+          <w:rFonts w:ascii="Times New Roman" w:hAnsi="Times New Roman" w:cs="Times New Roman"/>
+          <w:sz w:val="28"/>
+          <w:szCs w:val="28"/>
+        </w:rPr>
+      </w:pPr>
+      <w:r>
+        <w:rPr>
+          <w:rFonts w:ascii="Times New Roman" w:hAnsi="Times New Roman" w:cs="Times New Roman"/>
+          <w:noProof/>
+          <w:sz w:val="28"/>
+          <w:szCs w:val="28"/>
+        </w:rPr>
+        <w:drawing>
+          <wp:inline distT="0" distB="0" distL="0" distR="0" wp14:anchorId="3659D823" wp14:editId="73317FEB">
+            <wp:extent cx="5760720" cy="2783205"/>
+            <wp:effectExtent l="0" t="0" r="0" b="0"/>
+            <wp:docPr id="6" name="Picture 6"/>
+            <wp:cNvGraphicFramePr>
+              <a:graphicFrameLocks xmlns:a="http://schemas.openxmlformats.org/drawingml/2006/main" noChangeAspect="1"/>
+            </wp:cNvGraphicFramePr>
+            <a:graphic xmlns:a="http://schemas.openxmlformats.org/drawingml/2006/main">
+              <a:graphicData uri="http://schemas.openxmlformats.org/drawingml/2006/picture">
+                <pic:pic xmlns:pic="http://schemas.openxmlformats.org/drawingml/2006/picture">
+                  <pic:nvPicPr>
+                    <pic:cNvPr id="1" name=""/>
+                    <pic:cNvPicPr/>
+                  </pic:nvPicPr>
+                  <pic:blipFill>
+                    <a:blip r:embed="rId11"/>
+                    <a:stretch>
+                      <a:fillRect/>
+                    </a:stretch>
+                  </pic:blipFill>
+                  <pic:spPr>
+                    <a:xfrm>
+                      <a:off x="0" y="0"/>
+                      <a:ext cx="5760720" cy="2783205"/>
+                    </a:xfrm>
+                    <a:prstGeom prst="rect">
+                      <a:avLst/>
+                    </a:prstGeom>
+                  </pic:spPr>
+                </pic:pic>
+              </a:graphicData>
+            </a:graphic>
+          </wp:inline>
+        </w:drawing>
+      </w:r>
+    </w:p>
+    <w:p>
+      <w:pPr>
+        <w:rPr>
+          <w:rFonts w:ascii="Times New Roman" w:hAnsi="Times New Roman" w:cs="Times New Roman"/>
+          <w:sz w:val="28"/>
+          <w:szCs w:val="28"/>
+        </w:rPr>
+      </w:pPr>
+    </w:p>
+    <w:p>
+      <w:pPr>
+        <w:rPr>
+          <w:rFonts w:ascii="Times New Roman" w:hAnsi="Times New Roman" w:cs="Times New Roman"/>
+          <w:sz w:val="28"/>
+          <w:szCs w:val="28"/>
+        </w:rPr>
+      </w:pPr>
+    </w:p>
+    <w:p>
+      <w:pPr>
+        <w:pStyle w:val="ListParagraph"/>
+        <w:numPr>
+          <w:ilvl w:val="0"/>
+          <w:numId w:val="3"/>
+        </w:numPr>
+        <w:rPr>
+          <w:rFonts w:ascii="Times New Roman" w:hAnsi="Times New Roman" w:cs="Times New Roman"/>
+          <w:b/>
+          <w:bCs/>
+          <w:sz w:val="28"/>
+          <w:szCs w:val="28"/>
+        </w:rPr>
+      </w:pPr>
+      <w:r>
+        <w:rPr>
+          <w:rFonts w:ascii="Times New Roman" w:hAnsi="Times New Roman" w:cs="Times New Roman"/>
+          <w:b/>
+          <w:bCs/>
+          <w:sz w:val="28"/>
+          <w:szCs w:val="28"/>
+        </w:rPr>
+        <w:t>Apres l</w:t>
+      </w:r>
+      <w:r>
+        <w:rPr>
+          <w:rFonts w:ascii="Times New Roman" w:hAnsi="Times New Roman" w:cs="Times New Roman"/>
+          <w:b/>
+          <w:bCs/>
+          <w:sz w:val="28"/>
+          <w:szCs w:val="28"/>
+        </w:rPr>
+        <w:t>’Authentification de</w:t>
+      </w:r>
+      <w:r>
+        <w:rPr>
+          <w:rFonts w:ascii="Times New Roman" w:hAnsi="Times New Roman" w:cs="Times New Roman"/>
+          <w:b/>
+          <w:bCs/>
+          <w:sz w:val="28"/>
+          <w:szCs w:val="28"/>
+        </w:rPr>
+        <w:t xml:space="preserve"> nouveau l’utilisateur</w:t>
+      </w:r>
+      <w:r>
+        <w:rPr>
+          <w:rFonts w:ascii="Times New Roman" w:hAnsi="Times New Roman" w:cs="Times New Roman"/>
+          <w:b/>
+          <w:bCs/>
+          <w:sz w:val="28"/>
+          <w:szCs w:val="28"/>
+        </w:rPr>
+        <w:t xml:space="preserve"> Roi12</w:t>
+      </w:r>
+      <w:r>
+        <w:rPr>
+          <w:rFonts w:ascii="Times New Roman" w:hAnsi="Times New Roman" w:cs="Times New Roman"/>
+          <w:b/>
+          <w:bCs/>
+          <w:sz w:val="28"/>
+          <w:szCs w:val="28"/>
+        </w:rPr>
+        <w:t xml:space="preserve">, il s’accède à son </w:t>
+      </w:r>
+      <w:proofErr w:type="spellStart"/>
+      <w:proofErr w:type="gramStart"/>
+      <w:r>
+        <w:rPr>
+          <w:rFonts w:ascii="Times New Roman" w:hAnsi="Times New Roman" w:cs="Times New Roman"/>
+          <w:b/>
+          <w:bCs/>
+          <w:sz w:val="28"/>
+          <w:szCs w:val="28"/>
+        </w:rPr>
+        <w:t>dashboard</w:t>
+      </w:r>
+      <w:proofErr w:type="spellEnd"/>
+      <w:r>
+        <w:rPr>
+          <w:rFonts w:ascii="Times New Roman" w:hAnsi="Times New Roman" w:cs="Times New Roman"/>
+          <w:b/>
+          <w:bCs/>
+          <w:sz w:val="28"/>
+          <w:szCs w:val="28"/>
+        </w:rPr>
+        <w:t xml:space="preserve"> .</w:t>
+      </w:r>
+      <w:proofErr w:type="gramEnd"/>
+    </w:p>
+    <w:p>
+      <w:pPr>
+        <w:rPr>
+          <w:rFonts w:ascii="Times New Roman" w:hAnsi="Times New Roman" w:cs="Times New Roman"/>
+          <w:sz w:val="28"/>
+          <w:szCs w:val="28"/>
+        </w:rPr>
+      </w:pPr>
+      <w:r>
+        <w:rPr>
+          <w:rFonts w:ascii="Times New Roman" w:hAnsi="Times New Roman" w:cs="Times New Roman"/>
+          <w:noProof/>
+          <w:sz w:val="28"/>
+          <w:szCs w:val="28"/>
+        </w:rPr>
+        <w:drawing>
+          <wp:inline distT="0" distB="0" distL="0" distR="0" wp14:anchorId="70DAAFFD" wp14:editId="44A24582">
+            <wp:extent cx="5760720" cy="2798445"/>
+            <wp:effectExtent l="0" t="0" r="0" b="1905"/>
+            <wp:docPr id="5" name="Picture 5"/>
+            <wp:cNvGraphicFramePr>
+              <a:graphicFrameLocks xmlns:a="http://schemas.openxmlformats.org/drawingml/2006/main" noChangeAspect="1"/>
+            </wp:cNvGraphicFramePr>
+            <a:graphic xmlns:a="http://schemas.openxmlformats.org/drawingml/2006/main">
+              <a:graphicData uri="http://schemas.openxmlformats.org/drawingml/2006/picture">
+                <pic:pic xmlns:pic="http://schemas.openxmlformats.org/drawingml/2006/picture">
+                  <pic:nvPicPr>
+                    <pic:cNvPr id="1" name=""/>
+                    <pic:cNvPicPr/>
+                  </pic:nvPicPr>
+                  <pic:blipFill>
+                    <a:blip r:embed="rId12"/>
+                    <a:stretch>
+                      <a:fillRect/>
+                    </a:stretch>
+                  </pic:blipFill>
+                  <pic:spPr>
+                    <a:xfrm>
+                      <a:off x="0" y="0"/>
+                      <a:ext cx="5760720" cy="2798445"/>
+                    </a:xfrm>
+                    <a:prstGeom prst="rect">
+                      <a:avLst/>
+                    </a:prstGeom>
+                  </pic:spPr>
+                </pic:pic>
+              </a:graphicData>
+            </a:graphic>
+          </wp:inline>
+        </w:drawing>
+      </w:r>
+    </w:p>
+    <w:p>
+      <w:pPr>
+        <w:rPr>
+          <w:rFonts w:ascii="Times New Roman" w:hAnsi="Times New Roman" w:cs="Times New Roman"/>
+          <w:sz w:val="28"/>
+          <w:szCs w:val="28"/>
+        </w:rPr>
+      </w:pPr>
+    </w:p>
+    <w:p>
+      <w:pPr>
+        <w:rPr>
+          <w:rFonts w:ascii="Times New Roman" w:hAnsi="Times New Roman" w:cs="Times New Roman"/>
+          <w:sz w:val="28"/>
+          <w:szCs w:val="28"/>
+        </w:rPr>
+      </w:pPr>
+      <w:r>
+        <w:rPr>
+          <w:rFonts w:ascii="Times New Roman" w:hAnsi="Times New Roman" w:cs="Times New Roman"/>
+          <w:sz w:val="28"/>
+          <w:szCs w:val="28"/>
+        </w:rPr>
+        <w:t xml:space="preserve">Le Dashboard de Roi12 est vide car il n’a pas encore </w:t>
+      </w:r>
+      <w:proofErr w:type="gramStart"/>
+      <w:r>
+        <w:rPr>
+          <w:rFonts w:ascii="Times New Roman" w:hAnsi="Times New Roman" w:cs="Times New Roman"/>
+          <w:sz w:val="28"/>
+          <w:szCs w:val="28"/>
+        </w:rPr>
+        <w:t>créer</w:t>
+      </w:r>
+      <w:proofErr w:type="gramEnd"/>
+      <w:r>
+        <w:rPr>
+          <w:rFonts w:ascii="Times New Roman" w:hAnsi="Times New Roman" w:cs="Times New Roman"/>
+          <w:sz w:val="28"/>
+          <w:szCs w:val="28"/>
+        </w:rPr>
+        <w:t xml:space="preserve"> aucun projet ni collaborateur d’un autre projet</w:t>
+      </w:r>
+    </w:p>
+    <w:p>
+      <w:pPr>
+        <w:rPr>
+          <w:rFonts w:ascii="Times New Roman" w:hAnsi="Times New Roman" w:cs="Times New Roman"/>
+          <w:sz w:val="28"/>
+          <w:szCs w:val="28"/>
+        </w:rPr>
+      </w:pPr>
+    </w:p>
+    <w:p>
+      <w:pPr>
+        <w:rPr>
+          <w:rFonts w:ascii="Times New Roman" w:hAnsi="Times New Roman" w:cs="Times New Roman"/>
+          <w:sz w:val="28"/>
+          <w:szCs w:val="28"/>
+        </w:rPr>
+      </w:pPr>
+    </w:p>
+    <w:p>
+      <w:pPr>
+        <w:rPr>
+          <w:rFonts w:ascii="Times New Roman" w:hAnsi="Times New Roman" w:cs="Times New Roman"/>
+          <w:sz w:val="28"/>
+          <w:szCs w:val="28"/>
+        </w:rPr>
+      </w:pPr>
+    </w:p>
+    <w:p>
+      <w:pPr>
+        <w:rPr>
+          <w:rFonts w:ascii="Times New Roman" w:hAnsi="Times New Roman" w:cs="Times New Roman"/>
+          <w:sz w:val="28"/>
+          <w:szCs w:val="28"/>
+        </w:rPr>
+      </w:pPr>
+    </w:p>
+    <w:p>
+      <w:pPr>
+        <w:rPr>
+          <w:rFonts w:ascii="Times New Roman" w:hAnsi="Times New Roman" w:cs="Times New Roman"/>
+          <w:sz w:val="28"/>
+          <w:szCs w:val="28"/>
+        </w:rPr>
+      </w:pPr>
+    </w:p>
+    <w:p>
+      <w:pPr>
+        <w:pStyle w:val="ListParagraph"/>
+        <w:numPr>
+          <w:ilvl w:val="0"/>
+          <w:numId w:val="2"/>
+        </w:numPr>
+        <w:rPr>
+          <w:rFonts w:ascii="Times New Roman" w:hAnsi="Times New Roman" w:cs="Times New Roman"/>
+          <w:b/>
+          <w:bCs/>
+          <w:sz w:val="28"/>
+          <w:szCs w:val="28"/>
+        </w:rPr>
+      </w:pPr>
+      <w:r>
+        <w:rPr>
+          <w:rFonts w:ascii="Times New Roman" w:hAnsi="Times New Roman" w:cs="Times New Roman"/>
+          <w:sz w:val="28"/>
+          <w:szCs w:val="28"/>
+        </w:rPr>
+        <w:t xml:space="preserve"> </w:t>
+      </w:r>
+      <w:r>
+        <w:rPr>
+          <w:rFonts w:ascii="Times New Roman" w:hAnsi="Times New Roman" w:cs="Times New Roman"/>
+          <w:b/>
+          <w:bCs/>
+          <w:sz w:val="28"/>
+          <w:szCs w:val="28"/>
+        </w:rPr>
+        <w:t>Authentification</w:t>
+      </w:r>
+      <w:r>
+        <w:rPr>
+          <w:rFonts w:ascii="Times New Roman" w:hAnsi="Times New Roman" w:cs="Times New Roman"/>
+          <w:b/>
+          <w:bCs/>
+          <w:sz w:val="28"/>
+          <w:szCs w:val="28"/>
+        </w:rPr>
+        <w:t xml:space="preserve"> d’un utilisateur qui a déjà créée des projets et qui a aussi collaborations </w:t>
+      </w:r>
+      <w:proofErr w:type="gramStart"/>
+      <w:r>
+        <w:rPr>
+          <w:rFonts w:ascii="Times New Roman" w:hAnsi="Times New Roman" w:cs="Times New Roman"/>
+          <w:b/>
+          <w:bCs/>
+          <w:sz w:val="28"/>
+          <w:szCs w:val="28"/>
+        </w:rPr>
+        <w:t xml:space="preserve">«  </w:t>
+      </w:r>
+      <w:r>
+        <w:rPr>
+          <w:rFonts w:ascii="Times New Roman" w:hAnsi="Times New Roman" w:cs="Times New Roman"/>
+          <w:b/>
+          <w:bCs/>
+          <w:sz w:val="28"/>
+          <w:szCs w:val="28"/>
+        </w:rPr>
+        <w:t>Jules</w:t>
+      </w:r>
+      <w:proofErr w:type="gramEnd"/>
+      <w:r>
+        <w:rPr>
+          <w:rFonts w:ascii="Times New Roman" w:hAnsi="Times New Roman" w:cs="Times New Roman"/>
+          <w:b/>
+          <w:bCs/>
+          <w:sz w:val="28"/>
+          <w:szCs w:val="28"/>
+        </w:rPr>
+        <w:t>  »</w:t>
+      </w:r>
+    </w:p>
+    <w:p>
+      <w:pPr>
+        <w:rPr>
+          <w:rFonts w:ascii="Times New Roman" w:hAnsi="Times New Roman" w:cs="Times New Roman"/>
+          <w:sz w:val="28"/>
+          <w:szCs w:val="28"/>
+        </w:rPr>
+      </w:pPr>
+    </w:p>
+    <w:p>
+      <w:pPr>
+        <w:rPr>
+          <w:rFonts w:ascii="Times New Roman" w:hAnsi="Times New Roman" w:cs="Times New Roman"/>
+          <w:sz w:val="28"/>
+          <w:szCs w:val="28"/>
+        </w:rPr>
+      </w:pPr>
+    </w:p>
+    <w:p>
+      <w:pPr>
+        <w:rPr>
+          <w:rFonts w:ascii="Times New Roman" w:hAnsi="Times New Roman" w:cs="Times New Roman"/>
+          <w:sz w:val="28"/>
+          <w:szCs w:val="28"/>
+        </w:rPr>
+      </w:pPr>
+    </w:p>
+    <w:p>
+      <w:pPr>
+        <w:rPr>
+          <w:rFonts w:ascii="Times New Roman" w:hAnsi="Times New Roman" w:cs="Times New Roman"/>
+          <w:sz w:val="28"/>
+          <w:szCs w:val="28"/>
+        </w:rPr>
+      </w:pPr>
+      <w:r>
+        <w:rPr>
+          <w:rFonts w:ascii="Times New Roman" w:hAnsi="Times New Roman" w:cs="Times New Roman"/>
+          <w:noProof/>
+          <w:sz w:val="28"/>
+          <w:szCs w:val="28"/>
+        </w:rPr>
+        <w:drawing>
+          <wp:inline distT="0" distB="0" distL="0" distR="0" wp14:anchorId="43E0FE50" wp14:editId="60C41AD7">
+            <wp:extent cx="5760720" cy="2729230"/>
+            <wp:effectExtent l="0" t="0" r="0" b="0"/>
+            <wp:docPr id="3" name="Picture 3"/>
+            <wp:cNvGraphicFramePr>
+              <a:graphicFrameLocks xmlns:a="http://schemas.openxmlformats.org/drawingml/2006/main" noChangeAspect="1"/>
+            </wp:cNvGraphicFramePr>
+            <a:graphic xmlns:a="http://schemas.openxmlformats.org/drawingml/2006/main">
+              <a:graphicData uri="http://schemas.openxmlformats.org/drawingml/2006/picture">
+                <pic:pic xmlns:pic="http://schemas.openxmlformats.org/drawingml/2006/picture">
+                  <pic:nvPicPr>
+                    <pic:cNvPr id="1" name=""/>
+                    <pic:cNvPicPr/>
+                  </pic:nvPicPr>
+                  <pic:blipFill>
+                    <a:blip r:embed="rId13"/>
+                    <a:stretch>
+                      <a:fillRect/>
+                    </a:stretch>
+                  </pic:blipFill>
+                  <pic:spPr>
+                    <a:xfrm>
+                      <a:off x="0" y="0"/>
+                      <a:ext cx="5760720" cy="2729230"/>
+                    </a:xfrm>
+                    <a:prstGeom prst="rect">
+                      <a:avLst/>
+                    </a:prstGeom>
+                  </pic:spPr>
+                </pic:pic>
+              </a:graphicData>
+            </a:graphic>
+          </wp:inline>
+        </w:drawing>
+      </w:r>
+    </w:p>
+    <w:p>
+      <w:pPr>
+        <w:rPr>
+          <w:rFonts w:ascii="Times New Roman" w:hAnsi="Times New Roman" w:cs="Times New Roman"/>
+          <w:sz w:val="28"/>
+          <w:szCs w:val="28"/>
+        </w:rPr>
+      </w:pPr>
+    </w:p>
+    <w:p>
+      <w:pPr>
+        <w:pStyle w:val="ListParagraph"/>
+        <w:numPr>
+          <w:ilvl w:val="0"/>
+          <w:numId w:val="2"/>
+        </w:numPr>
+        <w:rPr>
+          <w:rFonts w:ascii="Times New Roman" w:hAnsi="Times New Roman" w:cs="Times New Roman"/>
+          <w:b/>
+          <w:bCs/>
+          <w:sz w:val="28"/>
+          <w:szCs w:val="28"/>
+        </w:rPr>
+      </w:pPr>
+      <w:r>
+        <w:rPr>
+          <w:rFonts w:ascii="Times New Roman" w:hAnsi="Times New Roman" w:cs="Times New Roman"/>
+          <w:b/>
+          <w:bCs/>
+          <w:sz w:val="28"/>
+          <w:szCs w:val="28"/>
+        </w:rPr>
+        <w:t>Apres l’Authentification de Jules</w:t>
+      </w:r>
+    </w:p>
+    <w:p>
+      <w:pPr>
+        <w:rPr>
+          <w:rFonts w:ascii="Times New Roman" w:hAnsi="Times New Roman" w:cs="Times New Roman"/>
+          <w:sz w:val="28"/>
+          <w:szCs w:val="28"/>
+        </w:rPr>
+      </w:pPr>
+    </w:p>
+    <w:p>
+      <w:pPr>
+        <w:rPr>
+          <w:rFonts w:ascii="Times New Roman" w:hAnsi="Times New Roman" w:cs="Times New Roman"/>
+          <w:sz w:val="28"/>
+          <w:szCs w:val="28"/>
+        </w:rPr>
+      </w:pPr>
+      <w:r>
+        <w:rPr>
+          <w:rFonts w:ascii="Times New Roman" w:hAnsi="Times New Roman" w:cs="Times New Roman"/>
+          <w:noProof/>
+          <w:sz w:val="28"/>
+          <w:szCs w:val="28"/>
+        </w:rPr>
+        <w:lastRenderedPageBreak/>
+        <w:drawing>
+          <wp:inline distT="0" distB="0" distL="0" distR="0" wp14:anchorId="4335B01B" wp14:editId="12A3FE85">
+            <wp:extent cx="5760720" cy="2832100"/>
+            <wp:effectExtent l="0" t="0" r="0" b="6350"/>
+            <wp:docPr id="4" name="Picture 4"/>
+            <wp:cNvGraphicFramePr>
+              <a:graphicFrameLocks xmlns:a="http://schemas.openxmlformats.org/drawingml/2006/main" noChangeAspect="1"/>
+            </wp:cNvGraphicFramePr>
+            <a:graphic xmlns:a="http://schemas.openxmlformats.org/drawingml/2006/main">
+              <a:graphicData uri="http://schemas.openxmlformats.org/drawingml/2006/picture">
+                <pic:pic xmlns:pic="http://schemas.openxmlformats.org/drawingml/2006/picture">
+                  <pic:nvPicPr>
+                    <pic:cNvPr id="1" name=""/>
+                    <pic:cNvPicPr/>
+                  </pic:nvPicPr>
+                  <pic:blipFill>
+                    <a:blip r:embed="rId14"/>
+                    <a:stretch>
+                      <a:fillRect/>
+                    </a:stretch>
+                  </pic:blipFill>
+                  <pic:spPr>
+                    <a:xfrm>
+                      <a:off x="0" y="0"/>
+                      <a:ext cx="5760720" cy="2832100"/>
+                    </a:xfrm>
+                    <a:prstGeom prst="rect">
+                      <a:avLst/>
+                    </a:prstGeom>
+                  </pic:spPr>
+                </pic:pic>
+              </a:graphicData>
+            </a:graphic>
+          </wp:inline>
+        </w:drawing>
+      </w:r>
+    </w:p>
+    <w:p>
+      <w:pPr>
+        <w:rPr>
+          <w:rFonts w:ascii="Times New Roman" w:hAnsi="Times New Roman" w:cs="Times New Roman"/>
+          <w:sz w:val="28"/>
+          <w:szCs w:val="28"/>
+        </w:rPr>
+      </w:pPr>
+      <w:r>
+        <w:rPr>
+          <w:rFonts w:ascii="Times New Roman" w:hAnsi="Times New Roman" w:cs="Times New Roman"/>
+          <w:sz w:val="28"/>
+          <w:szCs w:val="28"/>
+        </w:rPr>
+        <w:t>Son Dashboard montre qu’il a créé 4 projet total, un projet terminé, 03 en cours et 2 collaborations.</w:t>
+      </w:r>
+    </w:p>
+    <w:p>
+      <w:pPr>
+        <w:rPr>
+          <w:rFonts w:ascii="Times New Roman" w:hAnsi="Times New Roman" w:cs="Times New Roman"/>
+          <w:sz w:val="28"/>
+          <w:szCs w:val="28"/>
+        </w:rPr>
+      </w:pPr>
+    </w:p>
+    <w:p>
+      <w:pPr>
+        <w:rPr>
+          <w:rFonts w:ascii="Times New Roman" w:hAnsi="Times New Roman" w:cs="Times New Roman"/>
+          <w:sz w:val="28"/>
+          <w:szCs w:val="28"/>
+        </w:rPr>
+      </w:pPr>
+    </w:p>
+    <w:p>
+      <w:pPr>
+        <w:pStyle w:val="ListParagraph"/>
+        <w:numPr>
+          <w:ilvl w:val="0"/>
+          <w:numId w:val="2"/>
+        </w:numPr>
+        <w:rPr>
+          <w:rFonts w:ascii="Times New Roman" w:hAnsi="Times New Roman" w:cs="Times New Roman"/>
+          <w:sz w:val="28"/>
+          <w:szCs w:val="28"/>
+        </w:rPr>
+      </w:pPr>
+      <w:r>
+        <w:rPr>
+          <w:rFonts w:ascii="Times New Roman" w:hAnsi="Times New Roman" w:cs="Times New Roman"/>
+          <w:b/>
+          <w:bCs/>
+          <w:sz w:val="28"/>
+          <w:szCs w:val="28"/>
+        </w:rPr>
+        <w:t>Création du projet</w:t>
+      </w:r>
+      <w:r>
+        <w:rPr>
+          <w:rFonts w:ascii="Times New Roman" w:hAnsi="Times New Roman" w:cs="Times New Roman"/>
+          <w:sz w:val="28"/>
+          <w:szCs w:val="28"/>
+        </w:rPr>
+        <w:t> </w:t>
+      </w:r>
+      <w:r>
+        <w:rPr>
+          <w:rFonts w:ascii="Times New Roman" w:hAnsi="Times New Roman" w:cs="Times New Roman"/>
+          <w:b/>
+          <w:bCs/>
+          <w:sz w:val="28"/>
+          <w:szCs w:val="28"/>
+        </w:rPr>
+        <w:t>pour le nouv</w:t>
+      </w:r>
+      <w:r>
+        <w:rPr>
+          <w:rFonts w:ascii="Times New Roman" w:hAnsi="Times New Roman" w:cs="Times New Roman"/>
+          <w:b/>
+          <w:bCs/>
+          <w:sz w:val="28"/>
+          <w:szCs w:val="28"/>
+        </w:rPr>
+        <w:t>el</w:t>
+      </w:r>
+      <w:r>
+        <w:rPr>
+          <w:rFonts w:ascii="Times New Roman" w:hAnsi="Times New Roman" w:cs="Times New Roman"/>
+          <w:b/>
+          <w:bCs/>
+          <w:sz w:val="28"/>
+          <w:szCs w:val="28"/>
+        </w:rPr>
+        <w:t xml:space="preserve"> </w:t>
+      </w:r>
+      <w:r>
+        <w:rPr>
+          <w:rFonts w:ascii="Times New Roman" w:hAnsi="Times New Roman" w:cs="Times New Roman"/>
+          <w:b/>
+          <w:bCs/>
+          <w:sz w:val="28"/>
+          <w:szCs w:val="28"/>
+        </w:rPr>
+        <w:t xml:space="preserve">utilisateur Roi12 </w:t>
+      </w:r>
+      <w:r>
+        <w:rPr>
+          <w:rFonts w:ascii="Times New Roman" w:hAnsi="Times New Roman" w:cs="Times New Roman"/>
+          <w:b/>
+          <w:bCs/>
+          <w:sz w:val="28"/>
+          <w:szCs w:val="28"/>
+        </w:rPr>
+        <w:t>:</w:t>
+      </w:r>
+    </w:p>
+    <w:p>
+      <w:pPr>
+        <w:rPr>
+          <w:rFonts w:ascii="Times New Roman" w:hAnsi="Times New Roman" w:cs="Times New Roman"/>
+          <w:sz w:val="28"/>
+          <w:szCs w:val="28"/>
+        </w:rPr>
+      </w:pPr>
+      <w:r>
+        <w:rPr>
+          <w:rFonts w:ascii="Times New Roman" w:hAnsi="Times New Roman" w:cs="Times New Roman"/>
+          <w:noProof/>
+          <w:sz w:val="28"/>
+          <w:szCs w:val="28"/>
+        </w:rPr>
+        <w:drawing>
+          <wp:inline distT="0" distB="0" distL="0" distR="0" wp14:anchorId="553E811E" wp14:editId="0F0FF45E">
+            <wp:extent cx="5760720" cy="2796540"/>
+            <wp:effectExtent l="0" t="0" r="0" b="3810"/>
+            <wp:docPr id="11" name="Picture 11"/>
+            <wp:cNvGraphicFramePr>
+              <a:graphicFrameLocks xmlns:a="http://schemas.openxmlformats.org/drawingml/2006/main" noChangeAspect="1"/>
+            </wp:cNvGraphicFramePr>
+            <a:graphic xmlns:a="http://schemas.openxmlformats.org/drawingml/2006/main">
+              <a:graphicData uri="http://schemas.openxmlformats.org/drawingml/2006/picture">
+                <pic:pic xmlns:pic="http://schemas.openxmlformats.org/drawingml/2006/picture">
+                  <pic:nvPicPr>
+                    <pic:cNvPr id="1" name=""/>
+                    <pic:cNvPicPr/>
+                  </pic:nvPicPr>
+                  <pic:blipFill>
+                    <a:blip r:embed="rId15"/>
+                    <a:stretch>
+                      <a:fillRect/>
+                    </a:stretch>
+                  </pic:blipFill>
+                  <pic:spPr>
+                    <a:xfrm>
+                      <a:off x="0" y="0"/>
+                      <a:ext cx="5760720" cy="2796540"/>
+                    </a:xfrm>
+                    <a:prstGeom prst="rect">
+                      <a:avLst/>
+                    </a:prstGeom>
+                  </pic:spPr>
+                </pic:pic>
+              </a:graphicData>
+            </a:graphic>
+          </wp:inline>
+        </w:drawing>
+      </w:r>
+    </w:p>
+    <w:p>
+      <w:pPr>
+        <w:rPr>
+          <w:rFonts w:ascii="Times New Roman" w:hAnsi="Times New Roman" w:cs="Times New Roman"/>
+          <w:sz w:val="28"/>
+          <w:szCs w:val="28"/>
+        </w:rPr>
+      </w:pPr>
+    </w:p>
+    <w:p>
+      <w:pPr>
+        <w:pStyle w:val="ListParagraph"/>
+        <w:numPr>
+          <w:ilvl w:val="0"/>
+          <w:numId w:val="3"/>
+        </w:numPr>
+        <w:rPr>
+          <w:rFonts w:ascii="Times New Roman" w:hAnsi="Times New Roman" w:cs="Times New Roman"/>
+          <w:b/>
+          <w:bCs/>
+          <w:sz w:val="28"/>
+          <w:szCs w:val="28"/>
+        </w:rPr>
+      </w:pPr>
+      <w:r>
+        <w:rPr>
+          <w:rFonts w:ascii="Times New Roman" w:hAnsi="Times New Roman" w:cs="Times New Roman"/>
+          <w:b/>
+          <w:bCs/>
+          <w:sz w:val="28"/>
+          <w:szCs w:val="28"/>
+        </w:rPr>
+        <w:t xml:space="preserve">Remplissage du formulaire </w:t>
+      </w:r>
+    </w:p>
+    <w:p>
+      <w:pPr>
+        <w:rPr>
+          <w:rFonts w:ascii="Times New Roman" w:hAnsi="Times New Roman" w:cs="Times New Roman"/>
+          <w:sz w:val="28"/>
+          <w:szCs w:val="28"/>
+        </w:rPr>
+      </w:pPr>
+      <w:r>
+        <w:rPr>
+          <w:rFonts w:ascii="Times New Roman" w:hAnsi="Times New Roman" w:cs="Times New Roman"/>
+          <w:noProof/>
+          <w:sz w:val="28"/>
+          <w:szCs w:val="28"/>
+        </w:rPr>
+        <w:lastRenderedPageBreak/>
+        <w:drawing>
+          <wp:inline distT="0" distB="0" distL="0" distR="0" wp14:anchorId="48FFD00A" wp14:editId="12DC742A">
+            <wp:extent cx="5760720" cy="2811145"/>
+            <wp:effectExtent l="0" t="0" r="0" b="8255"/>
+            <wp:docPr id="9" name="Picture 9"/>
+            <wp:cNvGraphicFramePr>
+              <a:graphicFrameLocks xmlns:a="http://schemas.openxmlformats.org/drawingml/2006/main" noChangeAspect="1"/>
+            </wp:cNvGraphicFramePr>
+            <a:graphic xmlns:a="http://schemas.openxmlformats.org/drawingml/2006/main">
+              <a:graphicData uri="http://schemas.openxmlformats.org/drawingml/2006/picture">
+                <pic:pic xmlns:pic="http://schemas.openxmlformats.org/drawingml/2006/picture">
+                  <pic:nvPicPr>
+                    <pic:cNvPr id="1" name=""/>
+                    <pic:cNvPicPr/>
+                  </pic:nvPicPr>
+                  <pic:blipFill>
+                    <a:blip r:embed="rId16"/>
+                    <a:stretch>
+                      <a:fillRect/>
+                    </a:stretch>
+                  </pic:blipFill>
+                  <pic:spPr>
+                    <a:xfrm>
+                      <a:off x="0" y="0"/>
+                      <a:ext cx="5760720" cy="2811145"/>
+                    </a:xfrm>
+                    <a:prstGeom prst="rect">
+                      <a:avLst/>
+                    </a:prstGeom>
+                  </pic:spPr>
+                </pic:pic>
+              </a:graphicData>
+            </a:graphic>
+          </wp:inline>
+        </w:drawing>
+      </w:r>
+    </w:p>
+    <w:p>
+      <w:pPr>
+        <w:rPr>
+          <w:rFonts w:ascii="Times New Roman" w:hAnsi="Times New Roman" w:cs="Times New Roman"/>
+          <w:sz w:val="28"/>
+          <w:szCs w:val="28"/>
+        </w:rPr>
+      </w:pPr>
+    </w:p>
+    <w:p>
+      <w:pPr>
+        <w:rPr>
+          <w:rFonts w:ascii="Times New Roman" w:hAnsi="Times New Roman" w:cs="Times New Roman"/>
+          <w:sz w:val="28"/>
+          <w:szCs w:val="28"/>
+        </w:rPr>
+      </w:pPr>
+    </w:p>
+    <w:p>
+      <w:pPr>
+        <w:rPr>
+          <w:rFonts w:ascii="Times New Roman" w:hAnsi="Times New Roman" w:cs="Times New Roman"/>
+          <w:sz w:val="28"/>
+          <w:szCs w:val="28"/>
+        </w:rPr>
+      </w:pPr>
+    </w:p>
+    <w:p>
+      <w:pPr>
+        <w:rPr>
+          <w:rFonts w:ascii="Times New Roman" w:hAnsi="Times New Roman" w:cs="Times New Roman"/>
+          <w:sz w:val="28"/>
+          <w:szCs w:val="28"/>
+        </w:rPr>
+      </w:pPr>
+    </w:p>
+    <w:p>
+      <w:pPr>
+        <w:rPr>
+          <w:rFonts w:ascii="Times New Roman" w:hAnsi="Times New Roman" w:cs="Times New Roman"/>
+          <w:sz w:val="28"/>
+          <w:szCs w:val="28"/>
+        </w:rPr>
+      </w:pPr>
+    </w:p>
+    <w:p>
+      <w:pPr>
+        <w:rPr>
+          <w:rFonts w:ascii="Times New Roman" w:hAnsi="Times New Roman" w:cs="Times New Roman"/>
+          <w:sz w:val="28"/>
+          <w:szCs w:val="28"/>
+        </w:rPr>
+      </w:pPr>
+    </w:p>
+    <w:p>
+      <w:pPr>
+        <w:pStyle w:val="ListParagraph"/>
+        <w:numPr>
+          <w:ilvl w:val="0"/>
+          <w:numId w:val="3"/>
+        </w:numPr>
+        <w:rPr>
+          <w:rFonts w:ascii="Times New Roman" w:hAnsi="Times New Roman" w:cs="Times New Roman"/>
+          <w:b/>
+          <w:bCs/>
+          <w:sz w:val="28"/>
+          <w:szCs w:val="28"/>
+        </w:rPr>
+      </w:pPr>
+      <w:r>
+        <w:rPr>
+          <w:rFonts w:ascii="Times New Roman" w:hAnsi="Times New Roman" w:cs="Times New Roman"/>
+          <w:b/>
+          <w:bCs/>
+          <w:sz w:val="28"/>
+          <w:szCs w:val="28"/>
+        </w:rPr>
+        <w:t>Après soumission du formulaire</w:t>
+      </w:r>
+      <w:r>
+        <w:rPr>
+          <w:rFonts w:ascii="Times New Roman" w:hAnsi="Times New Roman" w:cs="Times New Roman"/>
+          <w:b/>
+          <w:bCs/>
+          <w:sz w:val="28"/>
+          <w:szCs w:val="28"/>
+        </w:rPr>
+        <w:t xml:space="preserve">, il y a un message de succès qui apparait </w:t>
+      </w:r>
+    </w:p>
+    <w:p>
+      <w:pPr>
+        <w:rPr>
+          <w:rFonts w:ascii="Times New Roman" w:hAnsi="Times New Roman" w:cs="Times New Roman"/>
+          <w:sz w:val="28"/>
+          <w:szCs w:val="28"/>
+        </w:rPr>
+      </w:pPr>
+      <w:r>
+        <w:rPr>
+          <w:rFonts w:ascii="Times New Roman" w:hAnsi="Times New Roman" w:cs="Times New Roman"/>
+          <w:noProof/>
+          <w:sz w:val="28"/>
+          <w:szCs w:val="28"/>
+        </w:rPr>
+        <w:drawing>
+          <wp:inline distT="0" distB="0" distL="0" distR="0" wp14:anchorId="120E1D69" wp14:editId="40EE0911">
+            <wp:extent cx="5760720" cy="2750820"/>
+            <wp:effectExtent l="0" t="0" r="0" b="0"/>
+            <wp:docPr id="10" name="Picture 10"/>
+            <wp:cNvGraphicFramePr>
+              <a:graphicFrameLocks xmlns:a="http://schemas.openxmlformats.org/drawingml/2006/main" noChangeAspect="1"/>
+            </wp:cNvGraphicFramePr>
+            <a:graphic xmlns:a="http://schemas.openxmlformats.org/drawingml/2006/main">
+              <a:graphicData uri="http://schemas.openxmlformats.org/drawingml/2006/picture">
+                <pic:pic xmlns:pic="http://schemas.openxmlformats.org/drawingml/2006/picture">
+                  <pic:nvPicPr>
+                    <pic:cNvPr id="1" name=""/>
+                    <pic:cNvPicPr/>
+                  </pic:nvPicPr>
+                  <pic:blipFill>
+                    <a:blip r:embed="rId17"/>
+                    <a:stretch>
+                      <a:fillRect/>
+                    </a:stretch>
+                  </pic:blipFill>
+                  <pic:spPr>
+                    <a:xfrm>
+                      <a:off x="0" y="0"/>
+                      <a:ext cx="5760720" cy="2750820"/>
+                    </a:xfrm>
+                    <a:prstGeom prst="rect">
+                      <a:avLst/>
+                    </a:prstGeom>
+                  </pic:spPr>
+                </pic:pic>
+              </a:graphicData>
+            </a:graphic>
+          </wp:inline>
+        </w:drawing>
+      </w:r>
+    </w:p>
+    <w:p>
+      <w:pPr>
+        <w:rPr>
+          <w:rFonts w:ascii="Times New Roman" w:hAnsi="Times New Roman" w:cs="Times New Roman"/>
+          <w:sz w:val="28"/>
+          <w:szCs w:val="28"/>
+        </w:rPr>
+      </w:pPr>
+    </w:p>
+    <w:p>
+      <w:pPr>
+        <w:rPr>
+          <w:rFonts w:ascii="Times New Roman" w:hAnsi="Times New Roman" w:cs="Times New Roman"/>
+          <w:sz w:val="28"/>
+          <w:szCs w:val="28"/>
+        </w:rPr>
+      </w:pPr>
+    </w:p>
+    <w:p>
+      <w:pPr>
+        <w:pStyle w:val="ListParagraph"/>
+        <w:numPr>
+          <w:ilvl w:val="0"/>
+          <w:numId w:val="3"/>
+        </w:numPr>
+        <w:rPr>
+          <w:rFonts w:ascii="Times New Roman" w:hAnsi="Times New Roman" w:cs="Times New Roman"/>
+          <w:sz w:val="28"/>
+          <w:szCs w:val="28"/>
+        </w:rPr>
+      </w:pPr>
+      <w:r>
+        <w:rPr>
+          <w:rFonts w:ascii="Times New Roman" w:hAnsi="Times New Roman" w:cs="Times New Roman"/>
+          <w:sz w:val="28"/>
+          <w:szCs w:val="28"/>
+        </w:rPr>
+        <w:lastRenderedPageBreak/>
+        <w:t xml:space="preserve">Le </w:t>
+      </w:r>
+      <w:r>
+        <w:rPr>
+          <w:rFonts w:ascii="Times New Roman" w:hAnsi="Times New Roman" w:cs="Times New Roman"/>
+          <w:sz w:val="28"/>
+          <w:szCs w:val="28"/>
+        </w:rPr>
+        <w:t>D</w:t>
+      </w:r>
+      <w:r>
+        <w:rPr>
+          <w:rFonts w:ascii="Times New Roman" w:hAnsi="Times New Roman" w:cs="Times New Roman"/>
+          <w:sz w:val="28"/>
+          <w:szCs w:val="28"/>
+        </w:rPr>
+        <w:t xml:space="preserve">ashboard après création de projet : </w:t>
+      </w:r>
+    </w:p>
+    <w:p>
+      <w:pPr>
+        <w:pStyle w:val="ListParagraph"/>
+        <w:ind w:left="1800"/>
+        <w:rPr>
+          <w:rFonts w:ascii="Times New Roman" w:hAnsi="Times New Roman" w:cs="Times New Roman"/>
+          <w:sz w:val="28"/>
+          <w:szCs w:val="28"/>
+        </w:rPr>
+      </w:pPr>
+    </w:p>
+    <w:p>
+      <w:pPr>
+        <w:rPr>
+          <w:rFonts w:ascii="Times New Roman" w:hAnsi="Times New Roman" w:cs="Times New Roman"/>
+          <w:sz w:val="28"/>
+          <w:szCs w:val="28"/>
+        </w:rPr>
+      </w:pPr>
+      <w:r>
+        <w:rPr>
+          <w:rFonts w:ascii="Times New Roman" w:hAnsi="Times New Roman" w:cs="Times New Roman"/>
+          <w:noProof/>
+          <w:sz w:val="28"/>
+          <w:szCs w:val="28"/>
+        </w:rPr>
+        <w:drawing>
+          <wp:inline distT="0" distB="0" distL="0" distR="0" wp14:anchorId="56A6C86B" wp14:editId="2B53E87E">
+            <wp:extent cx="5760720" cy="2786380"/>
+            <wp:effectExtent l="0" t="0" r="0" b="0"/>
+            <wp:docPr id="12" name="Picture 12"/>
+            <wp:cNvGraphicFramePr>
+              <a:graphicFrameLocks xmlns:a="http://schemas.openxmlformats.org/drawingml/2006/main" noChangeAspect="1"/>
+            </wp:cNvGraphicFramePr>
+            <a:graphic xmlns:a="http://schemas.openxmlformats.org/drawingml/2006/main">
+              <a:graphicData uri="http://schemas.openxmlformats.org/drawingml/2006/picture">
+                <pic:pic xmlns:pic="http://schemas.openxmlformats.org/drawingml/2006/picture">
+                  <pic:nvPicPr>
+                    <pic:cNvPr id="1" name=""/>
+                    <pic:cNvPicPr/>
+                  </pic:nvPicPr>
+                  <pic:blipFill>
+                    <a:blip r:embed="rId18"/>
+                    <a:stretch>
+                      <a:fillRect/>
+                    </a:stretch>
+                  </pic:blipFill>
+                  <pic:spPr>
+                    <a:xfrm>
+                      <a:off x="0" y="0"/>
+                      <a:ext cx="5760720" cy="2786380"/>
+                    </a:xfrm>
+                    <a:prstGeom prst="rect">
+                      <a:avLst/>
+                    </a:prstGeom>
+                  </pic:spPr>
+                </pic:pic>
+              </a:graphicData>
+            </a:graphic>
+          </wp:inline>
+        </w:drawing>
+      </w:r>
+    </w:p>
+    <w:p>
+      <w:pPr>
+        <w:rPr>
+          <w:rFonts w:ascii="Times New Roman" w:hAnsi="Times New Roman" w:cs="Times New Roman"/>
+          <w:sz w:val="28"/>
+          <w:szCs w:val="28"/>
+        </w:rPr>
+      </w:pPr>
+      <w:r>
+        <w:rPr>
+          <w:rFonts w:ascii="Times New Roman" w:hAnsi="Times New Roman" w:cs="Times New Roman"/>
+          <w:sz w:val="28"/>
+          <w:szCs w:val="28"/>
+        </w:rPr>
+        <w:t xml:space="preserve">3. Navigation dans les menus de </w:t>
+      </w:r>
+      <w:proofErr w:type="spellStart"/>
+      <w:r>
+        <w:rPr>
+          <w:rFonts w:ascii="Times New Roman" w:hAnsi="Times New Roman" w:cs="Times New Roman"/>
+          <w:sz w:val="28"/>
+          <w:szCs w:val="28"/>
+        </w:rPr>
+        <w:t>Dashbaord</w:t>
+      </w:r>
+      <w:proofErr w:type="spellEnd"/>
+    </w:p>
+    <w:p>
+      <w:pPr>
+        <w:pStyle w:val="ListParagraph"/>
+        <w:numPr>
+          <w:ilvl w:val="0"/>
+          <w:numId w:val="3"/>
+        </w:numPr>
+        <w:rPr>
+          <w:rFonts w:ascii="Times New Roman" w:hAnsi="Times New Roman" w:cs="Times New Roman"/>
+          <w:sz w:val="28"/>
+          <w:szCs w:val="28"/>
+        </w:rPr>
+      </w:pPr>
+      <w:r>
+        <w:rPr>
+          <w:rFonts w:ascii="Times New Roman" w:hAnsi="Times New Roman" w:cs="Times New Roman"/>
+          <w:sz w:val="28"/>
+          <w:szCs w:val="28"/>
+        </w:rPr>
+        <w:t xml:space="preserve">Menu </w:t>
+      </w:r>
+      <w:r>
+        <w:rPr>
+          <w:rFonts w:ascii="Times New Roman" w:hAnsi="Times New Roman" w:cs="Times New Roman"/>
+          <w:b/>
+          <w:bCs/>
+          <w:sz w:val="28"/>
+          <w:szCs w:val="28"/>
+        </w:rPr>
+        <w:t xml:space="preserve">‘’ </w:t>
+      </w:r>
+      <w:r>
+        <w:rPr>
+          <w:rFonts w:ascii="Times New Roman" w:hAnsi="Times New Roman" w:cs="Times New Roman"/>
+          <w:b/>
+          <w:bCs/>
+          <w:sz w:val="28"/>
+          <w:szCs w:val="28"/>
+        </w:rPr>
+        <w:t>Mes Projets</w:t>
+      </w:r>
+      <w:r>
+        <w:rPr>
+          <w:rFonts w:ascii="Times New Roman" w:hAnsi="Times New Roman" w:cs="Times New Roman"/>
+          <w:b/>
+          <w:bCs/>
+          <w:sz w:val="28"/>
+          <w:szCs w:val="28"/>
+        </w:rPr>
+        <w:t xml:space="preserve"> ’’</w:t>
+      </w:r>
+    </w:p>
+    <w:p>
+      <w:pPr>
+        <w:rPr>
+          <w:rFonts w:ascii="Times New Roman" w:hAnsi="Times New Roman" w:cs="Times New Roman"/>
+          <w:sz w:val="28"/>
+          <w:szCs w:val="28"/>
+        </w:rPr>
+      </w:pPr>
+      <w:r>
+        <w:rPr>
+          <w:rFonts w:ascii="Times New Roman" w:hAnsi="Times New Roman" w:cs="Times New Roman"/>
+          <w:noProof/>
+          <w:sz w:val="28"/>
+          <w:szCs w:val="28"/>
+        </w:rPr>
+        <w:drawing>
+          <wp:inline distT="0" distB="0" distL="0" distR="0" wp14:anchorId="718781EA" wp14:editId="5243B3DD">
+            <wp:extent cx="5760720" cy="2948305"/>
+            <wp:effectExtent l="0" t="0" r="0" b="4445"/>
+            <wp:docPr id="14" name="Picture 14"/>
+            <wp:cNvGraphicFramePr>
+              <a:graphicFrameLocks xmlns:a="http://schemas.openxmlformats.org/drawingml/2006/main" noChangeAspect="1"/>
+            </wp:cNvGraphicFramePr>
+            <a:graphic xmlns:a="http://schemas.openxmlformats.org/drawingml/2006/main">
+              <a:graphicData uri="http://schemas.openxmlformats.org/drawingml/2006/picture">
+                <pic:pic xmlns:pic="http://schemas.openxmlformats.org/drawingml/2006/picture">
+                  <pic:nvPicPr>
+                    <pic:cNvPr id="1" name=""/>
+                    <pic:cNvPicPr/>
+                  </pic:nvPicPr>
+                  <pic:blipFill>
+                    <a:blip r:embed="rId19"/>
+                    <a:stretch>
+                      <a:fillRect/>
+                    </a:stretch>
+                  </pic:blipFill>
+                  <pic:spPr>
+                    <a:xfrm>
+                      <a:off x="0" y="0"/>
+                      <a:ext cx="5760720" cy="2948305"/>
+                    </a:xfrm>
+                    <a:prstGeom prst="rect">
+                      <a:avLst/>
+                    </a:prstGeom>
+                  </pic:spPr>
+                </pic:pic>
+              </a:graphicData>
+            </a:graphic>
+          </wp:inline>
+        </w:drawing>
+      </w:r>
+    </w:p>
+    <w:p>
+      <w:pPr>
+        <w:rPr>
+          <w:rFonts w:ascii="Times New Roman" w:hAnsi="Times New Roman" w:cs="Times New Roman"/>
+          <w:sz w:val="28"/>
+          <w:szCs w:val="28"/>
+        </w:rPr>
+      </w:pPr>
+    </w:p>
+    <w:p>
+      <w:pPr>
+        <w:pStyle w:val="ListParagraph"/>
+        <w:numPr>
+          <w:ilvl w:val="0"/>
+          <w:numId w:val="2"/>
+        </w:numPr>
+        <w:rPr>
+          <w:rFonts w:ascii="Times New Roman" w:hAnsi="Times New Roman" w:cs="Times New Roman"/>
+          <w:sz w:val="28"/>
+          <w:szCs w:val="28"/>
+        </w:rPr>
+      </w:pPr>
+      <w:r>
+        <w:rPr>
+          <w:rFonts w:ascii="Times New Roman" w:hAnsi="Times New Roman" w:cs="Times New Roman"/>
+          <w:sz w:val="28"/>
+          <w:szCs w:val="28"/>
+        </w:rPr>
+        <w:t xml:space="preserve"> </w:t>
+      </w:r>
+      <w:r>
+        <w:rPr>
+          <w:rFonts w:ascii="Times New Roman" w:hAnsi="Times New Roman" w:cs="Times New Roman"/>
+          <w:sz w:val="28"/>
+          <w:szCs w:val="28"/>
+        </w:rPr>
+        <w:t xml:space="preserve">Menu </w:t>
+      </w:r>
+      <w:r>
+        <w:rPr>
+          <w:rFonts w:ascii="Times New Roman" w:hAnsi="Times New Roman" w:cs="Times New Roman"/>
+          <w:b/>
+          <w:bCs/>
+          <w:sz w:val="28"/>
+          <w:szCs w:val="28"/>
+        </w:rPr>
+        <w:t>‘’</w:t>
+      </w:r>
+      <w:r>
+        <w:rPr>
+          <w:rFonts w:ascii="Times New Roman" w:hAnsi="Times New Roman" w:cs="Times New Roman"/>
+          <w:b/>
+          <w:bCs/>
+          <w:sz w:val="28"/>
+          <w:szCs w:val="28"/>
+        </w:rPr>
+        <w:t xml:space="preserve">New </w:t>
+      </w:r>
+      <w:proofErr w:type="spellStart"/>
+      <w:r>
+        <w:rPr>
+          <w:rFonts w:ascii="Times New Roman" w:hAnsi="Times New Roman" w:cs="Times New Roman"/>
+          <w:b/>
+          <w:bCs/>
+          <w:sz w:val="28"/>
+          <w:szCs w:val="28"/>
+        </w:rPr>
+        <w:t>Task</w:t>
+      </w:r>
+      <w:proofErr w:type="spellEnd"/>
+      <w:r>
+        <w:rPr>
+          <w:rFonts w:ascii="Times New Roman" w:hAnsi="Times New Roman" w:cs="Times New Roman"/>
+          <w:b/>
+          <w:bCs/>
+          <w:sz w:val="28"/>
+          <w:szCs w:val="28"/>
+        </w:rPr>
+        <w:t xml:space="preserve"> ’’ :</w:t>
+      </w:r>
+      <w:r>
+        <w:rPr>
+          <w:rFonts w:ascii="Times New Roman" w:hAnsi="Times New Roman" w:cs="Times New Roman"/>
+          <w:b/>
+          <w:bCs/>
+          <w:sz w:val="28"/>
+          <w:szCs w:val="28"/>
+        </w:rPr>
+        <w:t xml:space="preserve"> </w:t>
+      </w:r>
+      <w:r>
+        <w:rPr>
+          <w:rFonts w:ascii="Times New Roman" w:hAnsi="Times New Roman" w:cs="Times New Roman"/>
+          <w:sz w:val="28"/>
+          <w:szCs w:val="28"/>
+        </w:rPr>
+        <w:t>Création une t</w:t>
+      </w:r>
+      <w:r>
+        <w:rPr>
+          <w:rFonts w:ascii="Times New Roman" w:hAnsi="Times New Roman" w:cs="Times New Roman"/>
+          <w:sz w:val="28"/>
+          <w:szCs w:val="28"/>
+        </w:rPr>
+        <w:t>â</w:t>
+      </w:r>
+      <w:r>
+        <w:rPr>
+          <w:rFonts w:ascii="Times New Roman" w:hAnsi="Times New Roman" w:cs="Times New Roman"/>
+          <w:sz w:val="28"/>
+          <w:szCs w:val="28"/>
+        </w:rPr>
+        <w:t>che</w:t>
+      </w:r>
+    </w:p>
+    <w:p>
+      <w:pPr>
+        <w:rPr>
+          <w:rFonts w:ascii="Times New Roman" w:hAnsi="Times New Roman" w:cs="Times New Roman"/>
+          <w:sz w:val="28"/>
+          <w:szCs w:val="28"/>
+        </w:rPr>
+      </w:pPr>
+    </w:p>
+    <w:p>
+      <w:pPr>
+        <w:rPr>
+          <w:rFonts w:ascii="Times New Roman" w:hAnsi="Times New Roman" w:cs="Times New Roman"/>
+          <w:sz w:val="28"/>
+          <w:szCs w:val="28"/>
+        </w:rPr>
+      </w:pPr>
+      <w:r>
+        <w:rPr>
+          <w:rFonts w:ascii="Times New Roman" w:hAnsi="Times New Roman" w:cs="Times New Roman"/>
+          <w:noProof/>
+          <w:sz w:val="28"/>
+          <w:szCs w:val="28"/>
+        </w:rPr>
+        <w:lastRenderedPageBreak/>
+        <w:drawing>
+          <wp:inline distT="0" distB="0" distL="0" distR="0" wp14:anchorId="2D4F3F77" wp14:editId="5B6947FA">
+            <wp:extent cx="5760720" cy="2831465"/>
+            <wp:effectExtent l="0" t="0" r="0" b="6985"/>
+            <wp:docPr id="17" name="Picture 17"/>
+            <wp:cNvGraphicFramePr>
+              <a:graphicFrameLocks xmlns:a="http://schemas.openxmlformats.org/drawingml/2006/main" noChangeAspect="1"/>
+            </wp:cNvGraphicFramePr>
+            <a:graphic xmlns:a="http://schemas.openxmlformats.org/drawingml/2006/main">
+              <a:graphicData uri="http://schemas.openxmlformats.org/drawingml/2006/picture">
+                <pic:pic xmlns:pic="http://schemas.openxmlformats.org/drawingml/2006/picture">
+                  <pic:nvPicPr>
+                    <pic:cNvPr id="1" name=""/>
+                    <pic:cNvPicPr/>
+                  </pic:nvPicPr>
+                  <pic:blipFill>
+                    <a:blip r:embed="rId20"/>
+                    <a:stretch>
+                      <a:fillRect/>
+                    </a:stretch>
+                  </pic:blipFill>
+                  <pic:spPr>
+                    <a:xfrm>
+                      <a:off x="0" y="0"/>
+                      <a:ext cx="5760720" cy="2831465"/>
+                    </a:xfrm>
+                    <a:prstGeom prst="rect">
+                      <a:avLst/>
+                    </a:prstGeom>
+                  </pic:spPr>
+                </pic:pic>
+              </a:graphicData>
+            </a:graphic>
+          </wp:inline>
+        </w:drawing>
+      </w:r>
+    </w:p>
+    <w:p>
+      <w:pPr>
+        <w:rPr>
+          <w:rFonts w:ascii="Times New Roman" w:hAnsi="Times New Roman" w:cs="Times New Roman"/>
+          <w:sz w:val="28"/>
+          <w:szCs w:val="28"/>
+        </w:rPr>
+      </w:pPr>
+      <w:r>
+        <w:rPr>
+          <w:rFonts w:ascii="Times New Roman" w:hAnsi="Times New Roman" w:cs="Times New Roman"/>
+          <w:noProof/>
+          <w:sz w:val="28"/>
+          <w:szCs w:val="28"/>
+        </w:rPr>
+        <w:drawing>
+          <wp:inline distT="0" distB="0" distL="0" distR="0" wp14:anchorId="016F9A4B" wp14:editId="7990C4FE">
+            <wp:extent cx="5760720" cy="2790825"/>
+            <wp:effectExtent l="0" t="0" r="0" b="9525"/>
+            <wp:docPr id="15" name="Picture 15"/>
+            <wp:cNvGraphicFramePr>
+              <a:graphicFrameLocks xmlns:a="http://schemas.openxmlformats.org/drawingml/2006/main" noChangeAspect="1"/>
+            </wp:cNvGraphicFramePr>
+            <a:graphic xmlns:a="http://schemas.openxmlformats.org/drawingml/2006/main">
+              <a:graphicData uri="http://schemas.openxmlformats.org/drawingml/2006/picture">
+                <pic:pic xmlns:pic="http://schemas.openxmlformats.org/drawingml/2006/picture">
+                  <pic:nvPicPr>
+                    <pic:cNvPr id="1" name=""/>
+                    <pic:cNvPicPr/>
+                  </pic:nvPicPr>
+                  <pic:blipFill>
+                    <a:blip r:embed="rId21"/>
+                    <a:stretch>
+                      <a:fillRect/>
+                    </a:stretch>
+                  </pic:blipFill>
+                  <pic:spPr>
+                    <a:xfrm>
+                      <a:off x="0" y="0"/>
+                      <a:ext cx="5760720" cy="2790825"/>
+                    </a:xfrm>
+                    <a:prstGeom prst="rect">
+                      <a:avLst/>
+                    </a:prstGeom>
+                  </pic:spPr>
+                </pic:pic>
+              </a:graphicData>
+            </a:graphic>
+          </wp:inline>
+        </w:drawing>
+      </w:r>
+    </w:p>
+    <w:p>
+      <w:pPr>
+        <w:rPr>
+          <w:rFonts w:ascii="Times New Roman" w:hAnsi="Times New Roman" w:cs="Times New Roman"/>
+          <w:sz w:val="28"/>
+          <w:szCs w:val="28"/>
+        </w:rPr>
+      </w:pPr>
+      <w:r>
+        <w:rPr>
+          <w:rFonts w:ascii="Times New Roman" w:hAnsi="Times New Roman" w:cs="Times New Roman"/>
+          <w:noProof/>
+          <w:sz w:val="28"/>
+          <w:szCs w:val="28"/>
+        </w:rPr>
+        <w:drawing>
+          <wp:inline distT="0" distB="0" distL="0" distR="0" wp14:anchorId="75EE3AAE" wp14:editId="161D370D">
+            <wp:extent cx="5760720" cy="2950845"/>
+            <wp:effectExtent l="0" t="0" r="0" b="1905"/>
+            <wp:docPr id="16" name="Picture 16"/>
+            <wp:cNvGraphicFramePr>
+              <a:graphicFrameLocks xmlns:a="http://schemas.openxmlformats.org/drawingml/2006/main" noChangeAspect="1"/>
+            </wp:cNvGraphicFramePr>
+            <a:graphic xmlns:a="http://schemas.openxmlformats.org/drawingml/2006/main">
+              <a:graphicData uri="http://schemas.openxmlformats.org/drawingml/2006/picture">
+                <pic:pic xmlns:pic="http://schemas.openxmlformats.org/drawingml/2006/picture">
+                  <pic:nvPicPr>
+                    <pic:cNvPr id="1" name=""/>
+                    <pic:cNvPicPr/>
+                  </pic:nvPicPr>
+                  <pic:blipFill>
+                    <a:blip r:embed="rId22"/>
+                    <a:stretch>
+                      <a:fillRect/>
+                    </a:stretch>
+                  </pic:blipFill>
+                  <pic:spPr>
+                    <a:xfrm>
+                      <a:off x="0" y="0"/>
+                      <a:ext cx="5760720" cy="2950845"/>
+                    </a:xfrm>
+                    <a:prstGeom prst="rect">
+                      <a:avLst/>
+                    </a:prstGeom>
+                  </pic:spPr>
+                </pic:pic>
+              </a:graphicData>
+            </a:graphic>
+          </wp:inline>
+        </w:drawing>
+      </w:r>
+    </w:p>
+    <w:p>
+      <w:pPr>
+        <w:rPr>
+          <w:rFonts w:ascii="Times New Roman" w:hAnsi="Times New Roman" w:cs="Times New Roman"/>
+          <w:sz w:val="28"/>
+          <w:szCs w:val="28"/>
+        </w:rPr>
+      </w:pPr>
+    </w:p>
+    <w:p>
+      <w:pPr>
+        <w:rPr>
+          <w:rFonts w:ascii="Times New Roman" w:hAnsi="Times New Roman" w:cs="Times New Roman"/>
+          <w:sz w:val="28"/>
+          <w:szCs w:val="28"/>
+        </w:rPr>
+      </w:pPr>
+      <w:r>
+        <w:rPr>
+          <w:rFonts w:ascii="Times New Roman" w:hAnsi="Times New Roman" w:cs="Times New Roman"/>
+          <w:sz w:val="28"/>
+          <w:szCs w:val="28"/>
+        </w:rPr>
+        <w:t xml:space="preserve">Menu </w:t>
+      </w:r>
+      <w:r>
+        <w:rPr>
+          <w:rFonts w:ascii="Times New Roman" w:hAnsi="Times New Roman" w:cs="Times New Roman"/>
+          <w:sz w:val="28"/>
+          <w:szCs w:val="28"/>
+        </w:rPr>
+        <w:t xml:space="preserve">Button </w:t>
+      </w:r>
+      <w:r>
+        <w:rPr>
+          <w:rFonts w:ascii="Times New Roman" w:hAnsi="Times New Roman" w:cs="Times New Roman"/>
+          <w:b/>
+          <w:bCs/>
+          <w:sz w:val="28"/>
+          <w:szCs w:val="28"/>
+        </w:rPr>
+        <w:t>‘’</w:t>
+      </w:r>
+      <w:r>
+        <w:rPr>
+          <w:rFonts w:ascii="Times New Roman" w:hAnsi="Times New Roman" w:cs="Times New Roman"/>
+          <w:b/>
+          <w:bCs/>
+          <w:sz w:val="28"/>
+          <w:szCs w:val="28"/>
+        </w:rPr>
+        <w:t xml:space="preserve"> Plus‘</w:t>
+      </w:r>
+      <w:proofErr w:type="gramStart"/>
+      <w:r>
+        <w:rPr>
+          <w:rFonts w:ascii="Times New Roman" w:hAnsi="Times New Roman" w:cs="Times New Roman"/>
+          <w:b/>
+          <w:bCs/>
+          <w:sz w:val="28"/>
+          <w:szCs w:val="28"/>
+        </w:rPr>
+        <w:t>’  qui</w:t>
+      </w:r>
+      <w:proofErr w:type="gramEnd"/>
+      <w:r>
+        <w:rPr>
+          <w:rFonts w:ascii="Times New Roman" w:hAnsi="Times New Roman" w:cs="Times New Roman"/>
+          <w:b/>
+          <w:bCs/>
+          <w:sz w:val="28"/>
+          <w:szCs w:val="28"/>
+        </w:rPr>
+        <w:t xml:space="preserve"> se trouve devant chaque projet dans l’espace Votre calendrier</w:t>
+      </w:r>
+    </w:p>
+    <w:p>
+      <w:pPr>
+        <w:rPr>
+          <w:rFonts w:ascii="Times New Roman" w:hAnsi="Times New Roman" w:cs="Times New Roman"/>
+          <w:sz w:val="28"/>
+          <w:szCs w:val="28"/>
+        </w:rPr>
+      </w:pPr>
+      <w:r>
+        <w:rPr>
+          <w:rFonts w:ascii="Times New Roman" w:hAnsi="Times New Roman" w:cs="Times New Roman"/>
+          <w:noProof/>
+          <w:sz w:val="28"/>
+          <w:szCs w:val="28"/>
+        </w:rPr>
+        <w:drawing>
+          <wp:inline distT="0" distB="0" distL="0" distR="0" wp14:anchorId="0EF1B46C" wp14:editId="19F249F3">
+            <wp:extent cx="5760720" cy="2834640"/>
+            <wp:effectExtent l="0" t="0" r="0" b="3810"/>
+            <wp:docPr id="18" name="Picture 18"/>
+            <wp:cNvGraphicFramePr>
+              <a:graphicFrameLocks xmlns:a="http://schemas.openxmlformats.org/drawingml/2006/main" noChangeAspect="1"/>
+            </wp:cNvGraphicFramePr>
+            <a:graphic xmlns:a="http://schemas.openxmlformats.org/drawingml/2006/main">
+              <a:graphicData uri="http://schemas.openxmlformats.org/drawingml/2006/picture">
+                <pic:pic xmlns:pic="http://schemas.openxmlformats.org/drawingml/2006/picture">
+                  <pic:nvPicPr>
+                    <pic:cNvPr id="1" name=""/>
+                    <pic:cNvPicPr/>
+                  </pic:nvPicPr>
+                  <pic:blipFill>
+                    <a:blip r:embed="rId23"/>
+                    <a:stretch>
+                      <a:fillRect/>
+                    </a:stretch>
+                  </pic:blipFill>
+                  <pic:spPr>
+                    <a:xfrm>
+                      <a:off x="0" y="0"/>
+                      <a:ext cx="5760720" cy="2834640"/>
+                    </a:xfrm>
+                    <a:prstGeom prst="rect">
+                      <a:avLst/>
+                    </a:prstGeom>
+                  </pic:spPr>
+                </pic:pic>
+              </a:graphicData>
+            </a:graphic>
+          </wp:inline>
+        </w:drawing>
+      </w:r>
+    </w:p>
+    <w:p>
+      <w:pPr>
+        <w:rPr>
+          <w:rFonts w:ascii="Times New Roman" w:hAnsi="Times New Roman" w:cs="Times New Roman"/>
+          <w:sz w:val="28"/>
+          <w:szCs w:val="28"/>
+        </w:rPr>
+      </w:pPr>
+    </w:p>
+    <w:p>
+      <w:pPr>
+        <w:pStyle w:val="ListParagraph"/>
+        <w:numPr>
+          <w:ilvl w:val="0"/>
+          <w:numId w:val="3"/>
+        </w:numPr>
+        <w:rPr>
+          <w:rFonts w:ascii="Times New Roman" w:hAnsi="Times New Roman" w:cs="Times New Roman"/>
+          <w:sz w:val="28"/>
+          <w:szCs w:val="28"/>
+        </w:rPr>
+      </w:pPr>
+      <w:r>
+        <w:rPr>
+          <w:rFonts w:ascii="Times New Roman" w:hAnsi="Times New Roman" w:cs="Times New Roman"/>
+          <w:sz w:val="28"/>
+          <w:szCs w:val="28"/>
+        </w:rPr>
+        <w:t xml:space="preserve">Bouton ‘’Plus’’ qui se trouve devant la </w:t>
+      </w:r>
+      <w:proofErr w:type="spellStart"/>
+      <w:r>
+        <w:rPr>
+          <w:rFonts w:ascii="Times New Roman" w:hAnsi="Times New Roman" w:cs="Times New Roman"/>
+          <w:sz w:val="28"/>
+          <w:szCs w:val="28"/>
+        </w:rPr>
+        <w:t>tache</w:t>
+      </w:r>
+      <w:proofErr w:type="spellEnd"/>
+      <w:r>
+        <w:rPr>
+          <w:rFonts w:ascii="Times New Roman" w:hAnsi="Times New Roman" w:cs="Times New Roman"/>
+          <w:sz w:val="28"/>
+          <w:szCs w:val="28"/>
+        </w:rPr>
+        <w:t xml:space="preserve"> du projet </w:t>
+      </w:r>
+      <w:proofErr w:type="spellStart"/>
+      <w:r>
+        <w:rPr>
+          <w:rFonts w:ascii="Times New Roman" w:hAnsi="Times New Roman" w:cs="Times New Roman"/>
+          <w:sz w:val="28"/>
+          <w:szCs w:val="28"/>
+        </w:rPr>
+        <w:t>FMJShop</w:t>
+      </w:r>
+      <w:proofErr w:type="spellEnd"/>
+      <w:r>
+        <w:rPr>
+          <w:rFonts w:ascii="Times New Roman" w:hAnsi="Times New Roman" w:cs="Times New Roman"/>
+          <w:sz w:val="28"/>
+          <w:szCs w:val="28"/>
+        </w:rPr>
+        <w:t xml:space="preserve"> </w:t>
+      </w:r>
+    </w:p>
+    <w:p>
+      <w:pPr>
+        <w:rPr>
+          <w:rFonts w:ascii="Times New Roman" w:hAnsi="Times New Roman" w:cs="Times New Roman"/>
+          <w:sz w:val="28"/>
+          <w:szCs w:val="28"/>
+        </w:rPr>
+      </w:pPr>
+      <w:r>
+        <w:rPr>
+          <w:rFonts w:ascii="Times New Roman" w:hAnsi="Times New Roman" w:cs="Times New Roman"/>
+          <w:noProof/>
+          <w:sz w:val="28"/>
+          <w:szCs w:val="28"/>
+        </w:rPr>
+        <w:drawing>
+          <wp:inline distT="0" distB="0" distL="0" distR="0" wp14:anchorId="4573EC48" wp14:editId="4BBBE302">
+            <wp:extent cx="5760720" cy="2781935"/>
+            <wp:effectExtent l="0" t="0" r="0" b="0"/>
+            <wp:docPr id="19" name="Picture 19"/>
+            <wp:cNvGraphicFramePr>
+              <a:graphicFrameLocks xmlns:a="http://schemas.openxmlformats.org/drawingml/2006/main" noChangeAspect="1"/>
+            </wp:cNvGraphicFramePr>
+            <a:graphic xmlns:a="http://schemas.openxmlformats.org/drawingml/2006/main">
+              <a:graphicData uri="http://schemas.openxmlformats.org/drawingml/2006/picture">
+                <pic:pic xmlns:pic="http://schemas.openxmlformats.org/drawingml/2006/picture">
+                  <pic:nvPicPr>
+                    <pic:cNvPr id="1" name=""/>
+                    <pic:cNvPicPr/>
+                  </pic:nvPicPr>
+                  <pic:blipFill>
+                    <a:blip r:embed="rId24"/>
+                    <a:stretch>
+                      <a:fillRect/>
+                    </a:stretch>
+                  </pic:blipFill>
+                  <pic:spPr>
+                    <a:xfrm>
+                      <a:off x="0" y="0"/>
+                      <a:ext cx="5760720" cy="2781935"/>
+                    </a:xfrm>
+                    <a:prstGeom prst="rect">
+                      <a:avLst/>
+                    </a:prstGeom>
+                  </pic:spPr>
+                </pic:pic>
+              </a:graphicData>
+            </a:graphic>
+          </wp:inline>
+        </w:drawing>
+      </w:r>
+    </w:p>
+    <w:p>
+      <w:pPr>
+        <w:pStyle w:val="ListParagraph"/>
+        <w:numPr>
+          <w:ilvl w:val="0"/>
+          <w:numId w:val="3"/>
+        </w:numPr>
+        <w:rPr>
+          <w:rFonts w:ascii="Times New Roman" w:hAnsi="Times New Roman" w:cs="Times New Roman"/>
+          <w:sz w:val="28"/>
+          <w:szCs w:val="28"/>
+        </w:rPr>
+      </w:pPr>
+      <w:r>
+        <w:rPr>
+          <w:rFonts w:ascii="Times New Roman" w:hAnsi="Times New Roman" w:cs="Times New Roman"/>
+          <w:sz w:val="28"/>
+          <w:szCs w:val="28"/>
+        </w:rPr>
+        <w:t>Button ‘’</w:t>
+      </w:r>
+      <w:r>
+        <w:rPr>
+          <w:rFonts w:ascii="Times New Roman" w:hAnsi="Times New Roman" w:cs="Times New Roman"/>
+          <w:b/>
+          <w:bCs/>
+          <w:sz w:val="28"/>
+          <w:szCs w:val="28"/>
+        </w:rPr>
+        <w:t>Assigner’</w:t>
+      </w:r>
+      <w:r>
+        <w:rPr>
+          <w:rFonts w:ascii="Times New Roman" w:hAnsi="Times New Roman" w:cs="Times New Roman"/>
+          <w:sz w:val="28"/>
+          <w:szCs w:val="28"/>
+        </w:rPr>
+        <w:t xml:space="preserve">’ pour assigner la tâche à un des collaborateurs </w:t>
+      </w:r>
+    </w:p>
+    <w:p>
+      <w:pPr>
+        <w:rPr>
+          <w:rFonts w:ascii="Times New Roman" w:hAnsi="Times New Roman" w:cs="Times New Roman"/>
+          <w:sz w:val="28"/>
+          <w:szCs w:val="28"/>
+        </w:rPr>
+      </w:pPr>
+      <w:r>
+        <w:lastRenderedPageBreak/>
+        <w:drawing>
+          <wp:inline distT="0" distB="0" distL="0" distR="0" wp14:anchorId="0DDE5C2D" wp14:editId="53493422">
+            <wp:extent cx="5760720" cy="2432050"/>
+            <wp:effectExtent l="0" t="0" r="0" b="6350"/>
+            <wp:docPr id="27" name="Picture 27"/>
+            <wp:cNvGraphicFramePr>
+              <a:graphicFrameLocks xmlns:a="http://schemas.openxmlformats.org/drawingml/2006/main" noChangeAspect="1"/>
+            </wp:cNvGraphicFramePr>
+            <a:graphic xmlns:a="http://schemas.openxmlformats.org/drawingml/2006/main">
+              <a:graphicData uri="http://schemas.openxmlformats.org/drawingml/2006/picture">
+                <pic:pic xmlns:pic="http://schemas.openxmlformats.org/drawingml/2006/picture">
+                  <pic:nvPicPr>
+                    <pic:cNvPr id="1" name=""/>
+                    <pic:cNvPicPr/>
+                  </pic:nvPicPr>
+                  <pic:blipFill>
+                    <a:blip r:embed="rId25"/>
+                    <a:stretch>
+                      <a:fillRect/>
+                    </a:stretch>
+                  </pic:blipFill>
+                  <pic:spPr>
+                    <a:xfrm>
+                      <a:off x="0" y="0"/>
+                      <a:ext cx="5760720" cy="2432050"/>
+                    </a:xfrm>
+                    <a:prstGeom prst="rect">
+                      <a:avLst/>
+                    </a:prstGeom>
+                  </pic:spPr>
+                </pic:pic>
+              </a:graphicData>
+            </a:graphic>
+          </wp:inline>
+        </w:drawing>
+      </w:r>
+    </w:p>
+    <w:p>
+      <w:pPr>
+        <w:rPr>
+          <w:rFonts w:ascii="Times New Roman" w:hAnsi="Times New Roman" w:cs="Times New Roman"/>
+          <w:sz w:val="28"/>
+          <w:szCs w:val="28"/>
+        </w:rPr>
+      </w:pPr>
+    </w:p>
+    <w:p>
+      <w:pPr>
+        <w:pStyle w:val="ListParagraph"/>
+        <w:numPr>
+          <w:ilvl w:val="0"/>
+          <w:numId w:val="2"/>
+        </w:numPr>
+        <w:rPr>
+          <w:rFonts w:ascii="Times New Roman" w:hAnsi="Times New Roman" w:cs="Times New Roman"/>
+          <w:sz w:val="28"/>
+          <w:szCs w:val="28"/>
+        </w:rPr>
+      </w:pPr>
+      <w:r>
+        <w:rPr>
+          <w:rFonts w:ascii="Times New Roman" w:hAnsi="Times New Roman" w:cs="Times New Roman"/>
+          <w:sz w:val="28"/>
+          <w:szCs w:val="28"/>
+        </w:rPr>
+        <w:t>Collaboration</w:t>
+      </w:r>
+    </w:p>
+    <w:p>
+      <w:pPr>
+        <w:pStyle w:val="ListParagraph"/>
+        <w:ind w:left="1440"/>
+        <w:rPr>
+          <w:rFonts w:ascii="Times New Roman" w:hAnsi="Times New Roman" w:cs="Times New Roman"/>
+          <w:sz w:val="28"/>
+          <w:szCs w:val="28"/>
+        </w:rPr>
+      </w:pPr>
+    </w:p>
+    <w:p>
+      <w:pPr>
+        <w:pStyle w:val="ListParagraph"/>
+        <w:ind w:left="1440"/>
+        <w:rPr>
+          <w:rFonts w:ascii="Times New Roman" w:hAnsi="Times New Roman" w:cs="Times New Roman"/>
+          <w:sz w:val="28"/>
+          <w:szCs w:val="28"/>
+        </w:rPr>
+      </w:pPr>
+      <w:r>
+        <w:rPr>
+          <w:rFonts w:ascii="Times New Roman" w:hAnsi="Times New Roman" w:cs="Times New Roman"/>
+          <w:sz w:val="28"/>
+          <w:szCs w:val="28"/>
+        </w:rPr>
+        <w:t>Pour collaborer</w:t>
+      </w:r>
+      <w:r>
+        <w:rPr>
+          <w:rFonts w:ascii="Times New Roman" w:hAnsi="Times New Roman" w:cs="Times New Roman"/>
+          <w:sz w:val="28"/>
+          <w:szCs w:val="28"/>
+        </w:rPr>
+        <w:t xml:space="preserve">, on sélectionne le projet, ensuite saisir le nom d’utilisateur puis cliquer sur le </w:t>
+      </w:r>
+      <w:proofErr w:type="spellStart"/>
+      <w:r>
+        <w:rPr>
+          <w:rFonts w:ascii="Times New Roman" w:hAnsi="Times New Roman" w:cs="Times New Roman"/>
+          <w:sz w:val="28"/>
+          <w:szCs w:val="28"/>
+        </w:rPr>
+        <w:t>boutton</w:t>
+      </w:r>
+      <w:proofErr w:type="spellEnd"/>
+      <w:r>
+        <w:rPr>
+          <w:rFonts w:ascii="Times New Roman" w:hAnsi="Times New Roman" w:cs="Times New Roman"/>
+          <w:sz w:val="28"/>
+          <w:szCs w:val="28"/>
+        </w:rPr>
+        <w:t xml:space="preserve"> « collaborer »</w:t>
+      </w:r>
+    </w:p>
+    <w:p>
+      <w:pPr>
+        <w:pStyle w:val="ListParagraph"/>
+        <w:ind w:left="1440"/>
+        <w:rPr>
+          <w:rFonts w:ascii="Times New Roman" w:hAnsi="Times New Roman" w:cs="Times New Roman"/>
+          <w:sz w:val="28"/>
+          <w:szCs w:val="28"/>
+        </w:rPr>
+      </w:pPr>
+    </w:p>
+    <w:p>
+      <w:pPr>
+        <w:rPr>
+          <w:rFonts w:ascii="Times New Roman" w:hAnsi="Times New Roman" w:cs="Times New Roman"/>
+          <w:sz w:val="28"/>
+          <w:szCs w:val="28"/>
+        </w:rPr>
+      </w:pPr>
+      <w:r>
+        <w:rPr>
+          <w:noProof/>
+        </w:rPr>
+        <w:drawing>
+          <wp:inline distT="0" distB="0" distL="0" distR="0" wp14:anchorId="5D208333" wp14:editId="0AF65815">
+            <wp:extent cx="5760720" cy="581660"/>
+            <wp:effectExtent l="0" t="0" r="0" b="8890"/>
+            <wp:docPr id="20" name="Picture 20"/>
+            <wp:cNvGraphicFramePr>
+              <a:graphicFrameLocks xmlns:a="http://schemas.openxmlformats.org/drawingml/2006/main" noChangeAspect="1"/>
+            </wp:cNvGraphicFramePr>
+            <a:graphic xmlns:a="http://schemas.openxmlformats.org/drawingml/2006/main">
+              <a:graphicData uri="http://schemas.openxmlformats.org/drawingml/2006/picture">
+                <pic:pic xmlns:pic="http://schemas.openxmlformats.org/drawingml/2006/picture">
+                  <pic:nvPicPr>
+                    <pic:cNvPr id="1" name=""/>
+                    <pic:cNvPicPr/>
+                  </pic:nvPicPr>
+                  <pic:blipFill>
+                    <a:blip r:embed="rId26"/>
+                    <a:stretch>
+                      <a:fillRect/>
+                    </a:stretch>
+                  </pic:blipFill>
+                  <pic:spPr>
+                    <a:xfrm>
+                      <a:off x="0" y="0"/>
+                      <a:ext cx="5760720" cy="581660"/>
+                    </a:xfrm>
+                    <a:prstGeom prst="rect">
+                      <a:avLst/>
+                    </a:prstGeom>
+                  </pic:spPr>
+                </pic:pic>
+              </a:graphicData>
+            </a:graphic>
+          </wp:inline>
+        </w:drawing>
+      </w:r>
+    </w:p>
+    <w:p>
+      <w:pPr>
+        <w:rPr>
+          <w:rFonts w:ascii="Times New Roman" w:hAnsi="Times New Roman" w:cs="Times New Roman"/>
+          <w:sz w:val="28"/>
+          <w:szCs w:val="28"/>
+        </w:rPr>
+      </w:pPr>
+    </w:p>
+    <w:p>
+      <w:pPr>
+        <w:rPr>
+          <w:rFonts w:ascii="Times New Roman" w:hAnsi="Times New Roman" w:cs="Times New Roman"/>
+          <w:sz w:val="28"/>
+          <w:szCs w:val="28"/>
+        </w:rPr>
+      </w:pPr>
+    </w:p>
+    <w:p>
+      <w:pPr>
+        <w:rPr>
+          <w:rFonts w:ascii="Times New Roman" w:hAnsi="Times New Roman" w:cs="Times New Roman"/>
+          <w:sz w:val="28"/>
+          <w:szCs w:val="28"/>
+        </w:rPr>
+      </w:pPr>
+    </w:p>
+    <w:p>
+      <w:pPr>
+        <w:rPr>
+          <w:rFonts w:ascii="Times New Roman" w:hAnsi="Times New Roman" w:cs="Times New Roman"/>
+          <w:sz w:val="28"/>
+          <w:szCs w:val="28"/>
+        </w:rPr>
+      </w:pPr>
+      <w:r>
+        <w:rPr>
+          <w:rFonts w:ascii="Times New Roman" w:hAnsi="Times New Roman" w:cs="Times New Roman"/>
+          <w:noProof/>
+          <w:sz w:val="28"/>
+          <w:szCs w:val="28"/>
+        </w:rPr>
+        <w:lastRenderedPageBreak/>
+        <w:drawing>
+          <wp:inline distT="0" distB="0" distL="0" distR="0" wp14:anchorId="739FD46D" wp14:editId="61092056">
+            <wp:extent cx="5760720" cy="5083175"/>
+            <wp:effectExtent l="0" t="0" r="0" b="3175"/>
+            <wp:docPr id="21" name="Picture 21"/>
+            <wp:cNvGraphicFramePr>
+              <a:graphicFrameLocks xmlns:a="http://schemas.openxmlformats.org/drawingml/2006/main" noChangeAspect="1"/>
+            </wp:cNvGraphicFramePr>
+            <a:graphic xmlns:a="http://schemas.openxmlformats.org/drawingml/2006/main">
+              <a:graphicData uri="http://schemas.openxmlformats.org/drawingml/2006/picture">
+                <pic:pic xmlns:pic="http://schemas.openxmlformats.org/drawingml/2006/picture">
+                  <pic:nvPicPr>
+                    <pic:cNvPr id="1" name=""/>
+                    <pic:cNvPicPr/>
+                  </pic:nvPicPr>
+                  <pic:blipFill>
+                    <a:blip r:embed="rId27"/>
+                    <a:stretch>
+                      <a:fillRect/>
+                    </a:stretch>
+                  </pic:blipFill>
+                  <pic:spPr>
+                    <a:xfrm>
+                      <a:off x="0" y="0"/>
+                      <a:ext cx="5760720" cy="5083175"/>
+                    </a:xfrm>
+                    <a:prstGeom prst="rect">
+                      <a:avLst/>
+                    </a:prstGeom>
+                  </pic:spPr>
+                </pic:pic>
+              </a:graphicData>
+            </a:graphic>
+          </wp:inline>
+        </w:drawing>
+      </w:r>
+    </w:p>
+    <w:p>
+      <w:pPr>
+        <w:rPr>
+          <w:rFonts w:ascii="Times New Roman" w:hAnsi="Times New Roman" w:cs="Times New Roman"/>
+          <w:sz w:val="28"/>
+          <w:szCs w:val="28"/>
+        </w:rPr>
+      </w:pPr>
+    </w:p>
+    <w:p>
+      <w:pPr>
+        <w:pStyle w:val="ListParagraph"/>
+        <w:numPr>
+          <w:ilvl w:val="0"/>
+          <w:numId w:val="3"/>
+        </w:numPr>
+        <w:rPr>
+          <w:rFonts w:ascii="Times New Roman" w:hAnsi="Times New Roman" w:cs="Times New Roman"/>
+          <w:sz w:val="28"/>
+          <w:szCs w:val="28"/>
+        </w:rPr>
+      </w:pPr>
+      <w:r>
+        <w:rPr>
+          <w:rFonts w:ascii="Times New Roman" w:hAnsi="Times New Roman" w:cs="Times New Roman"/>
+          <w:sz w:val="28"/>
+          <w:szCs w:val="28"/>
+        </w:rPr>
+        <w:t xml:space="preserve">Menu </w:t>
+      </w:r>
+      <w:r>
+        <w:rPr>
+          <w:rFonts w:ascii="Times New Roman" w:hAnsi="Times New Roman" w:cs="Times New Roman"/>
+          <w:b/>
+          <w:bCs/>
+          <w:sz w:val="28"/>
+          <w:szCs w:val="28"/>
+        </w:rPr>
+        <w:t>‘’ M</w:t>
+      </w:r>
+      <w:r>
+        <w:rPr>
+          <w:rFonts w:ascii="Times New Roman" w:hAnsi="Times New Roman" w:cs="Times New Roman"/>
+          <w:b/>
+          <w:bCs/>
+          <w:sz w:val="28"/>
+          <w:szCs w:val="28"/>
+        </w:rPr>
+        <w:t>es collaborations’’</w:t>
+      </w:r>
+    </w:p>
+    <w:p>
+      <w:pPr>
+        <w:rPr>
+          <w:rFonts w:ascii="Times New Roman" w:hAnsi="Times New Roman" w:cs="Times New Roman"/>
+          <w:sz w:val="28"/>
+          <w:szCs w:val="28"/>
+        </w:rPr>
+      </w:pPr>
+      <w:r>
+        <w:rPr>
+          <w:rFonts w:ascii="Times New Roman" w:hAnsi="Times New Roman" w:cs="Times New Roman"/>
+          <w:sz w:val="28"/>
+          <w:szCs w:val="28"/>
+        </w:rPr>
+        <w:drawing>
+          <wp:inline distT="0" distB="0" distL="0" distR="0" wp14:anchorId="6F64B8DB" wp14:editId="62CA271A">
+            <wp:extent cx="5760720" cy="2809875"/>
+            <wp:effectExtent l="0" t="0" r="0" b="9525"/>
+            <wp:docPr id="23" name="Picture 23"/>
+            <wp:cNvGraphicFramePr>
+              <a:graphicFrameLocks xmlns:a="http://schemas.openxmlformats.org/drawingml/2006/main" noChangeAspect="1"/>
+            </wp:cNvGraphicFramePr>
+            <a:graphic xmlns:a="http://schemas.openxmlformats.org/drawingml/2006/main">
+              <a:graphicData uri="http://schemas.openxmlformats.org/drawingml/2006/picture">
+                <pic:pic xmlns:pic="http://schemas.openxmlformats.org/drawingml/2006/picture">
+                  <pic:nvPicPr>
+                    <pic:cNvPr id="1" name=""/>
+                    <pic:cNvPicPr/>
+                  </pic:nvPicPr>
+                  <pic:blipFill>
+                    <a:blip r:embed="rId28"/>
+                    <a:stretch>
+                      <a:fillRect/>
+                    </a:stretch>
+                  </pic:blipFill>
+                  <pic:spPr>
+                    <a:xfrm>
+                      <a:off x="0" y="0"/>
+                      <a:ext cx="5760720" cy="2809875"/>
+                    </a:xfrm>
+                    <a:prstGeom prst="rect">
+                      <a:avLst/>
+                    </a:prstGeom>
+                  </pic:spPr>
+                </pic:pic>
+              </a:graphicData>
+            </a:graphic>
+          </wp:inline>
+        </w:drawing>
+      </w:r>
+    </w:p>
+    <w:p>
+      <w:pPr>
+        <w:pStyle w:val="ListParagraph"/>
+        <w:numPr>
+          <w:ilvl w:val="0"/>
+          <w:numId w:val="3"/>
+        </w:numPr>
+        <w:rPr>
+          <w:rFonts w:ascii="Times New Roman" w:hAnsi="Times New Roman" w:cs="Times New Roman"/>
+          <w:sz w:val="28"/>
+          <w:szCs w:val="28"/>
+        </w:rPr>
+      </w:pPr>
+      <w:r>
+        <w:rPr>
+          <w:rFonts w:ascii="Times New Roman" w:hAnsi="Times New Roman" w:cs="Times New Roman"/>
+          <w:sz w:val="28"/>
+          <w:szCs w:val="28"/>
+        </w:rPr>
+        <w:lastRenderedPageBreak/>
+        <w:t xml:space="preserve">Menu </w:t>
+      </w:r>
+      <w:r>
+        <w:rPr>
+          <w:rFonts w:ascii="Times New Roman" w:hAnsi="Times New Roman" w:cs="Times New Roman"/>
+          <w:b/>
+          <w:bCs/>
+          <w:sz w:val="28"/>
+          <w:szCs w:val="28"/>
+        </w:rPr>
+        <w:t xml:space="preserve">‘’ </w:t>
+      </w:r>
+      <w:r>
+        <w:rPr>
+          <w:rFonts w:ascii="Times New Roman" w:hAnsi="Times New Roman" w:cs="Times New Roman"/>
+          <w:b/>
+          <w:bCs/>
+          <w:sz w:val="28"/>
+          <w:szCs w:val="28"/>
+        </w:rPr>
+        <w:t>Mon compte’’</w:t>
+      </w:r>
+      <w:r>
+        <w:rPr>
+          <w:rFonts w:ascii="Times New Roman" w:hAnsi="Times New Roman" w:cs="Times New Roman"/>
+          <w:sz w:val="28"/>
+          <w:szCs w:val="28"/>
+        </w:rPr>
+        <w:t xml:space="preserve"> </w:t>
+      </w:r>
+    </w:p>
+    <w:p>
+      <w:pPr>
+        <w:rPr>
+          <w:rFonts w:ascii="Times New Roman" w:hAnsi="Times New Roman" w:cs="Times New Roman"/>
+          <w:sz w:val="28"/>
+          <w:szCs w:val="28"/>
+        </w:rPr>
+      </w:pPr>
+      <w:r>
+        <w:rPr>
+          <w:rFonts w:ascii="Times New Roman" w:hAnsi="Times New Roman" w:cs="Times New Roman"/>
+          <w:noProof/>
+          <w:sz w:val="28"/>
+          <w:szCs w:val="28"/>
+        </w:rPr>
+        <w:drawing>
+          <wp:inline distT="0" distB="0" distL="0" distR="0" wp14:anchorId="091A6CB2" wp14:editId="36EBD0E0">
+            <wp:extent cx="5760720" cy="2637155"/>
+            <wp:effectExtent l="0" t="0" r="0" b="0"/>
+            <wp:docPr id="13" name="Picture 13"/>
+            <wp:cNvGraphicFramePr>
+              <a:graphicFrameLocks xmlns:a="http://schemas.openxmlformats.org/drawingml/2006/main" noChangeAspect="1"/>
+            </wp:cNvGraphicFramePr>
+            <a:graphic xmlns:a="http://schemas.openxmlformats.org/drawingml/2006/main">
+              <a:graphicData uri="http://schemas.openxmlformats.org/drawingml/2006/picture">
+                <pic:pic xmlns:pic="http://schemas.openxmlformats.org/drawingml/2006/picture">
+                  <pic:nvPicPr>
+                    <pic:cNvPr id="1" name=""/>
+                    <pic:cNvPicPr/>
+                  </pic:nvPicPr>
+                  <pic:blipFill>
+                    <a:blip r:embed="rId29"/>
+                    <a:stretch>
+                      <a:fillRect/>
+                    </a:stretch>
+                  </pic:blipFill>
+                  <pic:spPr>
+                    <a:xfrm>
+                      <a:off x="0" y="0"/>
+                      <a:ext cx="5760720" cy="2637155"/>
+                    </a:xfrm>
+                    <a:prstGeom prst="rect">
+                      <a:avLst/>
+                    </a:prstGeom>
+                  </pic:spPr>
+                </pic:pic>
+              </a:graphicData>
+            </a:graphic>
+          </wp:inline>
+        </w:drawing>
+      </w:r>
+    </w:p>
+    <w:p>
+      <w:pPr>
+        <w:rPr>
+          <w:rFonts w:ascii="Times New Roman" w:hAnsi="Times New Roman" w:cs="Times New Roman"/>
+          <w:sz w:val="28"/>
+          <w:szCs w:val="28"/>
+        </w:rPr>
+      </w:pPr>
+      <w:r>
+        <w:rPr>
+          <w:rFonts w:ascii="Times New Roman" w:hAnsi="Times New Roman" w:cs="Times New Roman"/>
+          <w:sz w:val="28"/>
+          <w:szCs w:val="28"/>
+        </w:rPr>
+        <w:t>Ça montre les informations du profil utilisateurs.</w:t>
+      </w:r>
+    </w:p>
+    <w:p>
+      <w:pPr>
+        <w:rPr>
+          <w:rFonts w:ascii="Times New Roman" w:hAnsi="Times New Roman" w:cs="Times New Roman"/>
+          <w:sz w:val="28"/>
+          <w:szCs w:val="28"/>
+        </w:rPr>
+      </w:pPr>
+    </w:p>
+    <w:p>
+      <w:pPr>
+        <w:rPr>
+          <w:rFonts w:ascii="Times New Roman" w:hAnsi="Times New Roman" w:cs="Times New Roman"/>
+          <w:sz w:val="28"/>
+          <w:szCs w:val="28"/>
+        </w:rPr>
+      </w:pPr>
+      <w:r>
+        <w:rPr>
+          <w:rFonts w:ascii="Times New Roman" w:hAnsi="Times New Roman" w:cs="Times New Roman"/>
+          <w:sz w:val="28"/>
+          <w:szCs w:val="28"/>
+        </w:rPr>
+        <w:t>Plus :</w:t>
+      </w:r>
+    </w:p>
+    <w:p>
+      <w:pPr>
+        <w:rPr>
+          <w:rFonts w:ascii="Times New Roman" w:hAnsi="Times New Roman" w:cs="Times New Roman"/>
+          <w:sz w:val="28"/>
+          <w:szCs w:val="28"/>
+        </w:rPr>
+      </w:pPr>
+      <w:r>
+        <w:rPr>
+          <w:rFonts w:ascii="Times New Roman" w:hAnsi="Times New Roman" w:cs="Times New Roman"/>
+          <w:sz w:val="28"/>
+          <w:szCs w:val="28"/>
+        </w:rPr>
+        <w:t>Une tâche de statut ‘’ Terminée’’ est mon modifiable </w:t>
+      </w:r>
+    </w:p>
+    <w:p>
+      <w:pPr>
+        <w:rPr>
+          <w:rFonts w:ascii="Times New Roman" w:hAnsi="Times New Roman" w:cs="Times New Roman"/>
+          <w:sz w:val="28"/>
+          <w:szCs w:val="28"/>
+        </w:rPr>
+      </w:pPr>
+      <w:r>
+        <w:rPr>
+          <w:rFonts w:ascii="Times New Roman" w:hAnsi="Times New Roman" w:cs="Times New Roman"/>
+          <w:sz w:val="28"/>
+          <w:szCs w:val="28"/>
+        </w:rPr>
+        <w:drawing>
+          <wp:inline distT="0" distB="0" distL="0" distR="0" wp14:anchorId="6FB40E3A" wp14:editId="71A7E8D3">
+            <wp:extent cx="5760720" cy="2851150"/>
+            <wp:effectExtent l="0" t="0" r="0" b="6350"/>
+            <wp:docPr id="8" name="Picture 8"/>
+            <wp:cNvGraphicFramePr>
+              <a:graphicFrameLocks xmlns:a="http://schemas.openxmlformats.org/drawingml/2006/main" noChangeAspect="1"/>
+            </wp:cNvGraphicFramePr>
+            <a:graphic xmlns:a="http://schemas.openxmlformats.org/drawingml/2006/main">
+              <a:graphicData uri="http://schemas.openxmlformats.org/drawingml/2006/picture">
+                <pic:pic xmlns:pic="http://schemas.openxmlformats.org/drawingml/2006/picture">
+                  <pic:nvPicPr>
+                    <pic:cNvPr id="1" name=""/>
+                    <pic:cNvPicPr/>
+                  </pic:nvPicPr>
+                  <pic:blipFill>
+                    <a:blip r:embed="rId30"/>
+                    <a:stretch>
+                      <a:fillRect/>
+                    </a:stretch>
+                  </pic:blipFill>
+                  <pic:spPr>
+                    <a:xfrm>
+                      <a:off x="0" y="0"/>
+                      <a:ext cx="5760720" cy="2851150"/>
+                    </a:xfrm>
+                    <a:prstGeom prst="rect">
+                      <a:avLst/>
+                    </a:prstGeom>
+                  </pic:spPr>
+                </pic:pic>
+              </a:graphicData>
+            </a:graphic>
+          </wp:inline>
+        </w:drawing>
+      </w:r>
+    </w:p>
+    <w:p>
+      <w:pPr>
+        <w:rPr>
+          <w:rFonts w:ascii="Times New Roman" w:hAnsi="Times New Roman" w:cs="Times New Roman"/>
+          <w:sz w:val="28"/>
+          <w:szCs w:val="28"/>
+        </w:rPr>
+      </w:pPr>
+      <w:r>
+        <w:rPr>
+          <w:rFonts w:ascii="Times New Roman" w:hAnsi="Times New Roman" w:cs="Times New Roman"/>
+          <w:sz w:val="28"/>
+          <w:szCs w:val="28"/>
+        </w:rPr>
+        <w:t xml:space="preserve">Le bouton ‘’ </w:t>
+      </w:r>
+      <w:r>
+        <w:rPr>
+          <w:rFonts w:ascii="Times New Roman" w:hAnsi="Times New Roman" w:cs="Times New Roman"/>
+          <w:b/>
+          <w:bCs/>
+          <w:sz w:val="28"/>
+          <w:szCs w:val="28"/>
+        </w:rPr>
+        <w:t>modifier</w:t>
+      </w:r>
+      <w:r>
+        <w:rPr>
+          <w:rFonts w:ascii="Times New Roman" w:hAnsi="Times New Roman" w:cs="Times New Roman"/>
+          <w:sz w:val="28"/>
+          <w:szCs w:val="28"/>
+        </w:rPr>
+        <w:t>’’ n’apparait plus.</w:t>
+      </w:r>
+    </w:p>
+    <w:p>
+      <w:pPr>
+        <w:rPr>
+          <w:rFonts w:ascii="Times New Roman" w:hAnsi="Times New Roman" w:cs="Times New Roman"/>
+          <w:sz w:val="28"/>
+          <w:szCs w:val="28"/>
+        </w:rPr>
+      </w:pPr>
+    </w:p>
+    <w:p>
+      <w:pPr>
+        <w:rPr>
+          <w:rFonts w:ascii="Times New Roman" w:hAnsi="Times New Roman" w:cs="Times New Roman"/>
+          <w:sz w:val="28"/>
+          <w:szCs w:val="28"/>
+        </w:rPr>
+      </w:pPr>
+      <w:r>
+        <w:rPr>
+          <w:rFonts w:ascii="Times New Roman" w:hAnsi="Times New Roman" w:cs="Times New Roman"/>
+          <w:sz w:val="28"/>
+          <w:szCs w:val="28"/>
+        </w:rPr>
+        <w:t>U</w:t>
+      </w:r>
+      <w:r>
+        <w:rPr>
+          <w:rFonts w:ascii="Times New Roman" w:hAnsi="Times New Roman" w:cs="Times New Roman"/>
+          <w:sz w:val="28"/>
+          <w:szCs w:val="28"/>
+        </w:rPr>
+        <w:t>n projet</w:t>
+      </w:r>
+      <w:r>
+        <w:rPr>
+          <w:rFonts w:ascii="Times New Roman" w:hAnsi="Times New Roman" w:cs="Times New Roman"/>
+          <w:sz w:val="28"/>
+          <w:szCs w:val="28"/>
+        </w:rPr>
+        <w:t xml:space="preserve"> de statut ‘’ Terminée’’ est mon modifiable</w:t>
+      </w:r>
+      <w:r>
+        <w:rPr>
+          <w:rFonts w:ascii="Times New Roman" w:hAnsi="Times New Roman" w:cs="Times New Roman"/>
+          <w:sz w:val="28"/>
+          <w:szCs w:val="28"/>
+        </w:rPr>
+        <w:t> :</w:t>
+      </w:r>
+    </w:p>
+    <w:p>
+      <w:pPr>
+        <w:rPr>
+          <w:rFonts w:ascii="Times New Roman" w:hAnsi="Times New Roman" w:cs="Times New Roman"/>
+          <w:sz w:val="28"/>
+          <w:szCs w:val="28"/>
+        </w:rPr>
+      </w:pPr>
+      <w:r>
+        <w:rPr>
+          <w:rFonts w:ascii="Times New Roman" w:hAnsi="Times New Roman" w:cs="Times New Roman"/>
+          <w:sz w:val="28"/>
+          <w:szCs w:val="28"/>
+        </w:rPr>
+        <w:lastRenderedPageBreak/>
+        <w:drawing>
+          <wp:inline distT="0" distB="0" distL="0" distR="0" wp14:anchorId="3A3F4943" wp14:editId="3060AAE7">
+            <wp:extent cx="5760720" cy="3969385"/>
+            <wp:effectExtent l="0" t="0" r="0" b="0"/>
+            <wp:docPr id="22" name="Picture 22"/>
+            <wp:cNvGraphicFramePr>
+              <a:graphicFrameLocks xmlns:a="http://schemas.openxmlformats.org/drawingml/2006/main" noChangeAspect="1"/>
+            </wp:cNvGraphicFramePr>
+            <a:graphic xmlns:a="http://schemas.openxmlformats.org/drawingml/2006/main">
+              <a:graphicData uri="http://schemas.openxmlformats.org/drawingml/2006/picture">
+                <pic:pic xmlns:pic="http://schemas.openxmlformats.org/drawingml/2006/picture">
+                  <pic:nvPicPr>
+                    <pic:cNvPr id="1" name=""/>
+                    <pic:cNvPicPr/>
+                  </pic:nvPicPr>
+                  <pic:blipFill>
+                    <a:blip r:embed="rId31"/>
+                    <a:stretch>
+                      <a:fillRect/>
+                    </a:stretch>
+                  </pic:blipFill>
+                  <pic:spPr>
+                    <a:xfrm>
+                      <a:off x="0" y="0"/>
+                      <a:ext cx="5760720" cy="3969385"/>
+                    </a:xfrm>
+                    <a:prstGeom prst="rect">
+                      <a:avLst/>
+                    </a:prstGeom>
+                  </pic:spPr>
+                </pic:pic>
+              </a:graphicData>
+            </a:graphic>
+          </wp:inline>
+        </w:drawing>
+      </w:r>
+    </w:p>
+    <w:p>
+      <w:pPr>
+        <w:rPr>
+          <w:rFonts w:ascii="Times New Roman" w:hAnsi="Times New Roman" w:cs="Times New Roman"/>
+          <w:sz w:val="28"/>
+          <w:szCs w:val="28"/>
+        </w:rPr>
+      </w:pPr>
+    </w:p>
+    <w:p>
+      <w:pPr>
+        <w:rPr>
+          <w:rFonts w:ascii="Times New Roman" w:hAnsi="Times New Roman" w:cs="Times New Roman"/>
+          <w:sz w:val="28"/>
+          <w:szCs w:val="28"/>
+        </w:rPr>
+      </w:pPr>
+      <w:r>
+        <w:rPr>
+          <w:rFonts w:ascii="Times New Roman" w:hAnsi="Times New Roman" w:cs="Times New Roman"/>
+          <w:sz w:val="28"/>
+          <w:szCs w:val="28"/>
+        </w:rPr>
+        <w:t xml:space="preserve">Le bouton ‘’ </w:t>
+      </w:r>
+      <w:r>
+        <w:rPr>
+          <w:rFonts w:ascii="Times New Roman" w:hAnsi="Times New Roman" w:cs="Times New Roman"/>
+          <w:b/>
+          <w:bCs/>
+          <w:sz w:val="28"/>
+          <w:szCs w:val="28"/>
+        </w:rPr>
+        <w:t>modifier</w:t>
+      </w:r>
+      <w:r>
+        <w:rPr>
+          <w:rFonts w:ascii="Times New Roman" w:hAnsi="Times New Roman" w:cs="Times New Roman"/>
+          <w:sz w:val="28"/>
+          <w:szCs w:val="28"/>
+        </w:rPr>
+        <w:t>’’ n’apparait plus.</w:t>
+      </w:r>
+    </w:p>
+    <w:p>
+      <w:pPr>
+        <w:rPr>
+          <w:rFonts w:ascii="Times New Roman" w:hAnsi="Times New Roman" w:cs="Times New Roman"/>
+          <w:sz w:val="28"/>
+          <w:szCs w:val="28"/>
+        </w:rPr>
+      </w:pPr>
+    </w:p>
+    <w:p>
+      <w:pPr>
+        <w:rPr>
+          <w:rFonts w:ascii="Times New Roman" w:hAnsi="Times New Roman" w:cs="Times New Roman"/>
+          <w:sz w:val="28"/>
+          <w:szCs w:val="28"/>
+        </w:rPr>
+      </w:pPr>
+    </w:p>
+    <w:p>
+      <w:pPr>
+        <w:rPr>
+          <w:rFonts w:ascii="Times New Roman" w:hAnsi="Times New Roman" w:cs="Times New Roman"/>
+          <w:sz w:val="28"/>
+          <w:szCs w:val="28"/>
+        </w:rPr>
+      </w:pPr>
+    </w:p>
+    <w:p>
+      <w:pPr>
         <w:rPr>
           <w:rFonts w:ascii="Times New Roman" w:hAnsi="Times New Roman" w:cs="Times New Roman"/>
           <w:sz w:val="28"/>
@@ -861,7 +4031,7 @@
   <w:abstractNum w:abstractNumId="0" w15:restartNumberingAfterBreak="0">
     <w:nsid w:val="053B5F3C"/>
     <w:multiLevelType w:val="hybridMultilevel"/>
-    <w:tmpl w:val="A260E180"/>
+    <w:tmpl w:val="E0CA4280"/>
     <w:lvl w:ilvl="0" w:tplc="040C0001">
       <w:start w:val="1"/>
       <w:numFmt w:val="bullet"/>
@@ -974,7 +4144,7 @@
   <w:abstractNum w:abstractNumId="1" w15:restartNumberingAfterBreak="0">
     <w:nsid w:val="084E4666"/>
     <w:multiLevelType w:val="hybridMultilevel"/>
-    <w:tmpl w:val="5C24674A"/>
+    <w:tmpl w:val="9A147326"/>
     <w:lvl w:ilvl="0" w:tplc="601EB2E4">
       <w:start w:val="1"/>
       <w:numFmt w:val="bullet"/>
@@ -1174,6 +4344,119 @@
     </w:lvl>
   </w:abstractNum>
   <w:abstractNum w:abstractNumId="3" w15:restartNumberingAfterBreak="0">
+    <w:nsid w:val="558173D5"/>
+    <w:multiLevelType w:val="hybridMultilevel"/>
+    <w:tmpl w:val="24B45A38"/>
+    <w:lvl w:ilvl="0" w:tplc="7938EC2E">
+      <w:start w:val="3"/>
+      <w:numFmt w:val="bullet"/>
+      <w:lvlText w:val="-"/>
+      <w:lvlJc w:val="left"/>
+      <w:pPr>
+        <w:ind w:left="1800" w:hanging="360"/>
+      </w:pPr>
+      <w:rPr>
+        <w:rFonts w:ascii="Times New Roman" w:eastAsiaTheme="minorHAnsi" w:hAnsi="Times New Roman" w:cs="Times New Roman" w:hint="default"/>
+      </w:rPr>
+    </w:lvl>
+    <w:lvl w:ilvl="1" w:tplc="040C0003" w:tentative="1">
+      <w:start w:val="1"/>
+      <w:numFmt w:val="bullet"/>
+      <w:lvlText w:val="o"/>
+      <w:lvlJc w:val="left"/>
+      <w:pPr>
+        <w:ind w:left="2520" w:hanging="360"/>
+      </w:pPr>
+      <w:rPr>
+        <w:rFonts w:ascii="Courier New" w:hAnsi="Courier New" w:cs="Courier New" w:hint="default"/>
+      </w:rPr>
+    </w:lvl>
+    <w:lvl w:ilvl="2" w:tplc="040C0005" w:tentative="1">
+      <w:start w:val="1"/>
+      <w:numFmt w:val="bullet"/>
+      <w:lvlText w:val=""/>
+      <w:lvlJc w:val="left"/>
+      <w:pPr>
+        <w:ind w:left="3240" w:hanging="360"/>
+      </w:pPr>
+      <w:rPr>
+        <w:rFonts w:ascii="Wingdings" w:hAnsi="Wingdings" w:hint="default"/>
+      </w:rPr>
+    </w:lvl>
+    <w:lvl w:ilvl="3" w:tplc="040C0001" w:tentative="1">
+      <w:start w:val="1"/>
+      <w:numFmt w:val="bullet"/>
+      <w:lvlText w:val=""/>
+      <w:lvlJc w:val="left"/>
+      <w:pPr>
+        <w:ind w:left="3960" w:hanging="360"/>
+      </w:pPr>
+      <w:rPr>
+        <w:rFonts w:ascii="Symbol" w:hAnsi="Symbol" w:hint="default"/>
+      </w:rPr>
+    </w:lvl>
+    <w:lvl w:ilvl="4" w:tplc="040C0003" w:tentative="1">
+      <w:start w:val="1"/>
+      <w:numFmt w:val="bullet"/>
+      <w:lvlText w:val="o"/>
+      <w:lvlJc w:val="left"/>
+      <w:pPr>
+        <w:ind w:left="4680" w:hanging="360"/>
+      </w:pPr>
+      <w:rPr>
+        <w:rFonts w:ascii="Courier New" w:hAnsi="Courier New" w:cs="Courier New" w:hint="default"/>
+      </w:rPr>
+    </w:lvl>
+    <w:lvl w:ilvl="5" w:tplc="040C0005" w:tentative="1">
+      <w:start w:val="1"/>
+      <w:numFmt w:val="bullet"/>
+      <w:lvlText w:val=""/>
+      <w:lvlJc w:val="left"/>
+      <w:pPr>
+        <w:ind w:left="5400" w:hanging="360"/>
+      </w:pPr>
+      <w:rPr>
+        <w:rFonts w:ascii="Wingdings" w:hAnsi="Wingdings" w:hint="default"/>
+      </w:rPr>
+    </w:lvl>
+    <w:lvl w:ilvl="6" w:tplc="040C0001" w:tentative="1">
+      <w:start w:val="1"/>
+      <w:numFmt w:val="bullet"/>
+      <w:lvlText w:val=""/>
+      <w:lvlJc w:val="left"/>
+      <w:pPr>
+        <w:ind w:left="6120" w:hanging="360"/>
+      </w:pPr>
+      <w:rPr>
+        <w:rFonts w:ascii="Symbol" w:hAnsi="Symbol" w:hint="default"/>
+      </w:rPr>
+    </w:lvl>
+    <w:lvl w:ilvl="7" w:tplc="040C0003" w:tentative="1">
+      <w:start w:val="1"/>
+      <w:numFmt w:val="bullet"/>
+      <w:lvlText w:val="o"/>
+      <w:lvlJc w:val="left"/>
+      <w:pPr>
+        <w:ind w:left="6840" w:hanging="360"/>
+      </w:pPr>
+      <w:rPr>
+        <w:rFonts w:ascii="Courier New" w:hAnsi="Courier New" w:cs="Courier New" w:hint="default"/>
+      </w:rPr>
+    </w:lvl>
+    <w:lvl w:ilvl="8" w:tplc="040C0005" w:tentative="1">
+      <w:start w:val="1"/>
+      <w:numFmt w:val="bullet"/>
+      <w:lvlText w:val=""/>
+      <w:lvlJc w:val="left"/>
+      <w:pPr>
+        <w:ind w:left="7560" w:hanging="360"/>
+      </w:pPr>
+      <w:rPr>
+        <w:rFonts w:ascii="Wingdings" w:hAnsi="Wingdings" w:hint="default"/>
+      </w:rPr>
+    </w:lvl>
+  </w:abstractNum>
+  <w:abstractNum w:abstractNumId="4" w15:restartNumberingAfterBreak="0">
     <w:nsid w:val="6F834F8A"/>
     <w:multiLevelType w:val="hybridMultilevel"/>
     <w:tmpl w:val="4F6EADD2"/>
@@ -1296,6 +4579,9 @@
     <w:abstractNumId w:val="1"/>
   </w:num>
   <w:num w:numId="4">
+    <w:abstractNumId w:val="4"/>
+  </w:num>
+  <w:num w:numId="5">
     <w:abstractNumId w:val="3"/>
   </w:num>
 </w:numbering>
@@ -1701,6 +4987,7 @@
   <w:style w:type="paragraph" w:default="1" w:styleId="Normal">
     <w:name w:val="Normal"/>
     <w:qFormat/>
+    <w:rsid w:val="0091693B"/>
   </w:style>
   <w:style w:type="character" w:default="1" w:styleId="DefaultParagraphFont">
     <w:name w:val="Default Paragraph Font"/>

</xml_diff>